<commit_message>
IS and aiml notes added
</commit_message>
<xml_diff>
--- a/ACN/theory/unit_2.docx
+++ b/ACN/theory/unit_2.docx
@@ -236,26 +236,216 @@
         <w:t xml:space="preserve"> Routing between different Autonomous Systems across the internet (e.g., BGP). Priorities are administrative policy enforcement, loop prevention, and high scalability.</w:t>
       </w:r>
     </w:p>
-    <w:p>
-      <w:pPr>
-        <w:rPr>
-          <w:b/>
-          <w:bCs/>
-        </w:rPr>
-      </w:pPr>
-      <w:r>
-        <w:rPr>
-          <w:b/>
-          <w:bCs/>
-        </w:rPr>
-        <w:t>2. Graph Theory &amp; Structural Mechanics in Routing</w:t>
+    <w:p/>
+    <w:p/>
+    <w:p>
+      <w:r>
+        <w:rPr>
+          <w:noProof/>
+        </w:rPr>
+        <w:lastRenderedPageBreak/>
+        <w:drawing>
+          <wp:inline distT="0" distB="0" distL="0" distR="0" wp14:anchorId="60C60251" wp14:editId="67B1E983">
+            <wp:extent cx="5731510" cy="2719705"/>
+            <wp:effectExtent l="0" t="0" r="2540" b="4445"/>
+            <wp:docPr id="281755973" name="Picture 1"/>
+            <wp:cNvGraphicFramePr>
+              <a:graphicFrameLocks xmlns:a="http://schemas.openxmlformats.org/drawingml/2006/main" noChangeAspect="1"/>
+            </wp:cNvGraphicFramePr>
+            <a:graphic xmlns:a="http://schemas.openxmlformats.org/drawingml/2006/main">
+              <a:graphicData uri="http://schemas.openxmlformats.org/drawingml/2006/picture">
+                <pic:pic xmlns:pic="http://schemas.openxmlformats.org/drawingml/2006/picture">
+                  <pic:nvPicPr>
+                    <pic:cNvPr id="281755973" name="Picture 281755973"/>
+                    <pic:cNvPicPr/>
+                  </pic:nvPicPr>
+                  <pic:blipFill>
+                    <a:blip r:embed="rId6">
+                      <a:extLst>
+                        <a:ext uri="{28A0092B-C50C-407E-A947-70E740481C1C}">
+                          <a14:useLocalDpi xmlns:a14="http://schemas.microsoft.com/office/drawing/2010/main" val="0"/>
+                        </a:ext>
+                      </a:extLst>
+                    </a:blip>
+                    <a:stretch>
+                      <a:fillRect/>
+                    </a:stretch>
+                  </pic:blipFill>
+                  <pic:spPr>
+                    <a:xfrm>
+                      <a:off x="0" y="0"/>
+                      <a:ext cx="5731510" cy="2719705"/>
+                    </a:xfrm>
+                    <a:prstGeom prst="rect">
+                      <a:avLst/>
+                    </a:prstGeom>
+                  </pic:spPr>
+                </pic:pic>
+              </a:graphicData>
+            </a:graphic>
+          </wp:inline>
+        </w:drawing>
+      </w:r>
+    </w:p>
+    <w:p>
+      <w:pPr>
+        <w:pStyle w:val="Heading2"/>
+      </w:pPr>
+      <w:r>
+        <w:t>Link-State Routing</w:t>
+      </w:r>
+      <w:r>
+        <w:t>:</w:t>
+      </w:r>
+    </w:p>
+    <w:p>
+      <w:r>
+        <w:t xml:space="preserve">[Link-State </w:t>
+      </w:r>
+      <w:proofErr w:type="gramStart"/>
+      <w:r>
+        <w:t>Routing]  ─</w:t>
+      </w:r>
+      <w:proofErr w:type="gramEnd"/>
+      <w:r>
+        <w:t>─</w:t>
+      </w:r>
+      <w:proofErr w:type="gramStart"/>
+      <w:r>
+        <w:rPr>
+          <w:rFonts w:ascii="Arial" w:hAnsi="Arial" w:cs="Arial"/>
+        </w:rPr>
+        <w:t>►</w:t>
+      </w:r>
+      <w:r>
+        <w:t xml:space="preserve">  The</w:t>
+      </w:r>
+      <w:proofErr w:type="gramEnd"/>
+      <w:r>
+        <w:t xml:space="preserve"> Algorithmic Concept / Paradigm</w:t>
+      </w:r>
+    </w:p>
+    <w:p>
+      <w:r>
+        <w:t xml:space="preserve">           │</w:t>
+      </w:r>
+    </w:p>
+    <w:p>
+      <w:r>
+        <w:t xml:space="preserve">           </w:t>
+      </w:r>
+      <w:r>
+        <w:rPr>
+          <w:rFonts w:ascii="Arial" w:hAnsi="Arial" w:cs="Arial"/>
+        </w:rPr>
+        <w:t>▼</w:t>
+      </w:r>
+    </w:p>
+    <w:p>
+      <w:r>
+        <w:t xml:space="preserve">        [</w:t>
+      </w:r>
+      <w:proofErr w:type="gramStart"/>
+      <w:r>
+        <w:t xml:space="preserve">OSPF]   </w:t>
+      </w:r>
+      <w:proofErr w:type="gramEnd"/>
+      <w:r>
+        <w:t xml:space="preserve">        ──</w:t>
+      </w:r>
+      <w:proofErr w:type="gramStart"/>
+      <w:r>
+        <w:rPr>
+          <w:rFonts w:ascii="Arial" w:hAnsi="Arial" w:cs="Arial"/>
+        </w:rPr>
+        <w:t>►</w:t>
+      </w:r>
+      <w:r>
+        <w:t xml:space="preserve">  Unicast</w:t>
+      </w:r>
+      <w:proofErr w:type="gramEnd"/>
+      <w:r>
+        <w:t xml:space="preserve"> Implementation (One-to-One)</w:t>
+      </w:r>
+    </w:p>
+    <w:p>
+      <w:r>
+        <w:t xml:space="preserve">           │</w:t>
+      </w:r>
+    </w:p>
+    <w:p>
+      <w:r>
+        <w:t xml:space="preserve">           </w:t>
+      </w:r>
+      <w:r>
+        <w:rPr>
+          <w:rFonts w:ascii="Arial" w:hAnsi="Arial" w:cs="Arial"/>
+        </w:rPr>
+        <w:t>▼</w:t>
+      </w:r>
+    </w:p>
+    <w:p>
+      <w:r>
+        <w:t xml:space="preserve">        [</w:t>
+      </w:r>
+      <w:proofErr w:type="gramStart"/>
+      <w:r>
+        <w:t xml:space="preserve">MOSPF]   </w:t>
+      </w:r>
+      <w:proofErr w:type="gramEnd"/>
+      <w:r>
+        <w:t xml:space="preserve">       ──</w:t>
+      </w:r>
+      <w:proofErr w:type="gramStart"/>
+      <w:r>
+        <w:rPr>
+          <w:rFonts w:ascii="Arial" w:hAnsi="Arial" w:cs="Arial"/>
+        </w:rPr>
+        <w:t>►</w:t>
+      </w:r>
+      <w:r>
+        <w:t xml:space="preserve">  Multicast</w:t>
+      </w:r>
+      <w:proofErr w:type="gramEnd"/>
+      <w:r>
+        <w:t xml:space="preserve"> Extension (One-to-Many)</w:t>
+      </w:r>
+    </w:p>
+    <w:p>
+      <w:pPr>
+        <w:rPr>
+          <w:b/>
+          <w:bCs/>
+        </w:rPr>
+      </w:pPr>
+      <w:r>
+        <w:rPr>
+          <w:b/>
+          <w:bCs/>
+        </w:rPr>
+        <w:t>1. Link-State Routing (The Theoretical Foundation)</w:t>
+      </w:r>
+    </w:p>
+    <w:p>
+      <w:r>
+        <w:t xml:space="preserve">Link-State Routing is a </w:t>
+      </w:r>
+      <w:r>
+        <w:rPr>
+          <w:b/>
+          <w:bCs/>
+        </w:rPr>
+        <w:t>routing paradigm</w:t>
+      </w:r>
+      <w:r>
+        <w:t xml:space="preserve"> (or class of algorithms) where every router in a network acquires a complete, global view of the entire network topology before calculating paths.</w:t>
       </w:r>
     </w:p>
     <w:p>
       <w:pPr>
         <w:numPr>
           <w:ilvl w:val="0"/>
-          <w:numId w:val="2"/>
+          <w:numId w:val="6"/>
         </w:numPr>
       </w:pPr>
       <w:r>
@@ -263,76 +453,403 @@
           <w:b/>
           <w:bCs/>
         </w:rPr>
+        <w:t>Topology Mapping:</w:t>
+      </w:r>
+      <w:r>
+        <w:t xml:space="preserve"> Every router collects state information about its directly attached links (status, cost, bandwidth) and packages it into a </w:t>
+      </w:r>
+      <w:r>
+        <w:rPr>
+          <w:b/>
+          <w:bCs/>
+        </w:rPr>
+        <w:t>Link-State Packet (LSP)</w:t>
+      </w:r>
+      <w:r>
+        <w:t>.</w:t>
+      </w:r>
+    </w:p>
+    <w:p>
+      <w:pPr>
+        <w:numPr>
+          <w:ilvl w:val="0"/>
+          <w:numId w:val="6"/>
+        </w:numPr>
+      </w:pPr>
+      <w:r>
+        <w:rPr>
+          <w:b/>
+          <w:bCs/>
+        </w:rPr>
+        <w:t>Flooding:</w:t>
+      </w:r>
+      <w:r>
+        <w:t xml:space="preserve"> Routers flood these LSPs throughout the entire network so every router receives identical topological data.</w:t>
+      </w:r>
+    </w:p>
+    <w:p>
+      <w:pPr>
+        <w:numPr>
+          <w:ilvl w:val="0"/>
+          <w:numId w:val="6"/>
+        </w:numPr>
+      </w:pPr>
+      <w:r>
+        <w:rPr>
+          <w:b/>
+          <w:bCs/>
+        </w:rPr>
+        <w:t>Database &amp; Path Computation:</w:t>
+      </w:r>
+      <w:r>
+        <w:t xml:space="preserve"> Routers aggregate these LSPs into a global topology database and independently execute </w:t>
+      </w:r>
+      <w:r>
+        <w:rPr>
+          <w:b/>
+          <w:bCs/>
+        </w:rPr>
+        <w:t>Dijkstra’s Shortest Path Algorithm</w:t>
+      </w:r>
+      <w:r>
+        <w:t xml:space="preserve"> to construct a shortest-path tree rooted at themselves.</w:t>
+      </w:r>
+    </w:p>
+    <w:p>
+      <w:pPr>
+        <w:rPr>
+          <w:b/>
+          <w:bCs/>
+        </w:rPr>
+      </w:pPr>
+      <w:r>
+        <w:rPr>
+          <w:b/>
+          <w:bCs/>
+        </w:rPr>
+        <w:t>2. OSPF — Open Shortest Path First (The Unicast Implementation)</w:t>
+      </w:r>
+    </w:p>
+    <w:p>
+      <w:r>
+        <w:t xml:space="preserve">OSPF is a specific </w:t>
+      </w:r>
+      <w:r>
+        <w:rPr>
+          <w:b/>
+          <w:bCs/>
+        </w:rPr>
+        <w:t>unicast routing protocol</w:t>
+      </w:r>
+      <w:r>
+        <w:t xml:space="preserve"> built directly on top of the Link-State Routing paradigm for interior gateway routing (within an Autonomous System).</w:t>
+      </w:r>
+    </w:p>
+    <w:p>
+      <w:pPr>
+        <w:numPr>
+          <w:ilvl w:val="0"/>
+          <w:numId w:val="7"/>
+        </w:numPr>
+      </w:pPr>
+      <w:r>
+        <w:rPr>
+          <w:b/>
+          <w:bCs/>
+        </w:rPr>
+        <w:t>LSDB (Link-State Database):</w:t>
+      </w:r>
+      <w:r>
+        <w:t xml:space="preserve"> Implements the global topology map concept by flooding </w:t>
+      </w:r>
+      <w:r>
+        <w:rPr>
+          <w:b/>
+          <w:bCs/>
+        </w:rPr>
+        <w:t>Link-State Advertisements (LSAs)</w:t>
+      </w:r>
+      <w:r>
+        <w:t xml:space="preserve"> to maintain a synchronized LSDB across all routers.</w:t>
+      </w:r>
+    </w:p>
+    <w:p>
+      <w:pPr>
+        <w:numPr>
+          <w:ilvl w:val="0"/>
+          <w:numId w:val="7"/>
+        </w:numPr>
+      </w:pPr>
+      <w:r>
+        <w:rPr>
+          <w:b/>
+          <w:bCs/>
+        </w:rPr>
         <w:lastRenderedPageBreak/>
-        <w:t>Graph Representation:</w:t>
-      </w:r>
-      <w:r>
-        <w:t xml:space="preserve"> Networks are </w:t>
-      </w:r>
-      <w:proofErr w:type="spellStart"/>
-      <w:r>
-        <w:t>modeled</w:t>
-      </w:r>
-      <w:proofErr w:type="spellEnd"/>
-      <w:r>
-        <w:t xml:space="preserve"> as graphs </w:t>
+        <w:t>Unicast Routing:</w:t>
+      </w:r>
+      <w:r>
+        <w:t xml:space="preserve"> Calculates the optimal, loop-free shortest path from a single source router to every possible individual destination network address.</w:t>
+      </w:r>
+    </w:p>
+    <w:p>
+      <w:pPr>
+        <w:numPr>
+          <w:ilvl w:val="0"/>
+          <w:numId w:val="7"/>
+        </w:numPr>
+      </w:pPr>
+      <w:r>
+        <w:rPr>
+          <w:b/>
+          <w:bCs/>
+        </w:rPr>
+        <w:t>Hierarchical Areas:</w:t>
+      </w:r>
+      <w:r>
+        <w:t xml:space="preserve"> Extends basic Link-State theory to large enterprise networks by dividing the network into </w:t>
+      </w:r>
+      <w:r>
+        <w:rPr>
+          <w:b/>
+          <w:bCs/>
+        </w:rPr>
+        <w:t>Areas</w:t>
+      </w:r>
+      <w:r>
+        <w:t xml:space="preserve"> (with Area 0 as the backbone) to restrict LSA flooding scope and optimize router CPU/memory usage.</w:t>
+      </w:r>
+    </w:p>
+    <w:p>
+      <w:pPr>
+        <w:rPr>
+          <w:b/>
+          <w:bCs/>
+        </w:rPr>
+      </w:pPr>
+      <w:r>
+        <w:rPr>
+          <w:b/>
+          <w:bCs/>
+        </w:rPr>
+        <w:t>3. MOSPF — Multicast OSPF (The Multicast Extension)</w:t>
+      </w:r>
+    </w:p>
+    <w:p>
+      <w:r>
+        <w:t xml:space="preserve">MOSPF is an </w:t>
+      </w:r>
+      <w:r>
+        <w:rPr>
+          <w:b/>
+          <w:bCs/>
+        </w:rPr>
+        <w:t>extension of OSPF</w:t>
+      </w:r>
+      <w:r>
+        <w:t xml:space="preserve"> designed to handle </w:t>
+      </w:r>
+      <w:r>
+        <w:rPr>
+          <w:b/>
+          <w:bCs/>
+        </w:rPr>
+        <w:t>multicast traffic</w:t>
+      </w:r>
+      <w:r>
+        <w:t xml:space="preserve"> (delivering data from one sender to multiple interested receivers simultaneously).</w:t>
+      </w:r>
+    </w:p>
+    <w:p>
+      <w:pPr>
+        <w:numPr>
+          <w:ilvl w:val="0"/>
+          <w:numId w:val="8"/>
+        </w:numPr>
+      </w:pPr>
+      <w:r>
+        <w:rPr>
+          <w:b/>
+          <w:bCs/>
+        </w:rPr>
+        <w:t>Group-Membership LSAs:</w:t>
+      </w:r>
+      <w:r>
+        <w:t xml:space="preserve"> Enhances standard OSPF by introducing specialized LSAs (Type 6 LSAs) that carry multicast group membership information learned via IGMP from local hosts.</w:t>
+      </w:r>
+    </w:p>
+    <w:p>
+      <w:pPr>
+        <w:numPr>
+          <w:ilvl w:val="0"/>
+          <w:numId w:val="8"/>
+        </w:numPr>
+      </w:pPr>
+      <w:r>
+        <w:rPr>
+          <w:b/>
+          <w:bCs/>
+        </w:rPr>
+        <w:t>Source-Based Multicast Trees:</w:t>
+      </w:r>
+      <w:r>
+        <w:t xml:space="preserve"> Because multicast target receivers change dynamically, MOSPF routers use the existing OSPF LSDB combined with group membership LSAs to calculate a dynamic </w:t>
+      </w:r>
+      <w:r>
+        <w:rPr>
+          <w:b/>
+          <w:bCs/>
+        </w:rPr>
+        <w:t>source-rooted shortest-path tree</w:t>
+      </w:r>
+      <w:r>
+        <w:t xml:space="preserve"> on demand whenever a multicast packet arrives.</w:t>
+      </w:r>
+    </w:p>
+    <w:p>
+      <w:pPr>
+        <w:numPr>
+          <w:ilvl w:val="0"/>
+          <w:numId w:val="8"/>
+        </w:numPr>
+      </w:pPr>
+      <w:r>
+        <w:rPr>
+          <w:b/>
+          <w:bCs/>
+        </w:rPr>
+        <w:t>Traffic Forwarding:</w:t>
+      </w:r>
+      <w:r>
+        <w:t xml:space="preserve"> Ensures multicast data travels only along active branches that lead directly to group members, eliminating redundant traffic replication across the network.</w:t>
+      </w:r>
+    </w:p>
+    <w:p>
+      <w:pPr>
+        <w:pStyle w:val="Heading2"/>
+      </w:pPr>
+      <w:r>
+        <w:t>Components and packets:</w:t>
+      </w:r>
+    </w:p>
+    <w:p>
+      <w:r>
+        <w:rPr>
+          <w:b/>
+          <w:bCs/>
+        </w:rPr>
+        <w:t>1. Core IGP Components (Link-State Foundations)</w:t>
+      </w:r>
+    </w:p>
+    <w:p>
+      <w:pPr>
+        <w:numPr>
+          <w:ilvl w:val="0"/>
+          <w:numId w:val="9"/>
+        </w:numPr>
+      </w:pPr>
+      <w:r>
+        <w:rPr>
+          <w:b/>
+          <w:bCs/>
+        </w:rPr>
+        <w:t>Link-State Database (LSDB):</w:t>
+      </w:r>
+      <w:r>
+        <w:t xml:space="preserve"> </w:t>
+      </w:r>
+      <w:proofErr w:type="gramStart"/>
+      <w:r>
+        <w:t>A</w:t>
+      </w:r>
+      <w:proofErr w:type="gramEnd"/>
+      <w:r>
+        <w:t xml:space="preserve"> organized table stored on every link-state router containing topological information of the entire network area. All routers in the same area maintain identical LSDBs.</w:t>
+      </w:r>
+    </w:p>
+    <w:p>
+      <w:pPr>
+        <w:numPr>
+          <w:ilvl w:val="0"/>
+          <w:numId w:val="9"/>
+        </w:numPr>
+      </w:pPr>
+      <w:r>
+        <w:rPr>
+          <w:b/>
+          <w:bCs/>
+        </w:rPr>
+        <w:t>SPF (Shortest Path First):</w:t>
+      </w:r>
+      <w:r>
+        <w:t xml:space="preserve"> Dijkstra's algorithm executed on the LSDB to compute the shortest, loop-free path tree to every destination network, placing the local router at the root.</w:t>
+      </w:r>
+    </w:p>
+    <w:p>
+      <w:pPr>
+        <w:numPr>
+          <w:ilvl w:val="0"/>
+          <w:numId w:val="9"/>
+        </w:numPr>
+      </w:pPr>
+      <w:r>
+        <w:rPr>
+          <w:b/>
+          <w:bCs/>
+        </w:rPr>
+        <w:t>Cost Metric:</w:t>
+      </w:r>
+      <w:r>
+        <w:t xml:space="preserve"> The routing metric used by OSPF to evaluate paths. Calculated as </w:t>
       </w:r>
       <m:oMath>
+        <m:r>
+          <m:rPr>
+            <m:nor/>
+          </m:rPr>
+          <m:t>Cost</m:t>
+        </m:r>
         <m:r>
           <w:rPr>
             <w:rFonts w:ascii="Cambria Math" w:hAnsi="Cambria Math"/>
           </w:rPr>
-          <m:t>G=</m:t>
+          <m:t>=</m:t>
         </m:r>
-        <m:d>
-          <m:dPr>
+        <m:f>
+          <m:fPr>
             <m:ctrlPr>
               <w:rPr>
                 <w:rFonts w:ascii="Cambria Math" w:hAnsi="Cambria Math"/>
               </w:rPr>
             </m:ctrlPr>
-          </m:dPr>
-          <m:e>
+          </m:fPr>
+          <m:num>
             <m:r>
-              <w:rPr>
-                <w:rFonts w:ascii="Cambria Math" w:hAnsi="Cambria Math"/>
-              </w:rPr>
-              <m:t>V,E</m:t>
+              <m:rPr>
+                <m:nor/>
+              </m:rPr>
+              <m:t>Reference Bandwidth</m:t>
             </m:r>
-          </m:e>
-        </m:d>
+          </m:num>
+          <m:den>
+            <m:r>
+              <m:rPr>
+                <m:nor/>
+              </m:rPr>
+              <m:t>Interface Bandwidth</m:t>
+            </m:r>
+          </m:den>
+        </m:f>
       </m:oMath>
       <w:r>
-        <w:t>, where vertices (</w:t>
-      </w:r>
-      <m:oMath>
-        <m:r>
-          <w:rPr>
-            <w:rFonts w:ascii="Cambria Math" w:hAnsi="Cambria Math"/>
-          </w:rPr>
-          <m:t>V</m:t>
-        </m:r>
-      </m:oMath>
-      <w:r>
-        <w:t>) represent routers/networks and edges (</w:t>
-      </w:r>
-      <m:oMath>
-        <m:r>
-          <w:rPr>
-            <w:rFonts w:ascii="Cambria Math" w:hAnsi="Cambria Math"/>
-          </w:rPr>
-          <m:t>E</m:t>
-        </m:r>
-      </m:oMath>
-      <w:r>
-        <w:t>) represent communication links with defined costs.</w:t>
+        <w:t xml:space="preserve"> (Default Reference Bandwidth = 100 Mbps). Lower cost indicates a preferred route.</w:t>
       </w:r>
     </w:p>
     <w:p>
       <w:pPr>
         <w:numPr>
           <w:ilvl w:val="0"/>
-          <w:numId w:val="2"/>
+          <w:numId w:val="9"/>
         </w:numPr>
       </w:pPr>
       <w:r>
@@ -340,50 +857,35 @@
           <w:b/>
           <w:bCs/>
         </w:rPr>
-        <w:t>Path Metrics:</w:t>
-      </w:r>
-    </w:p>
-    <w:p>
-      <w:pPr>
-        <w:numPr>
-          <w:ilvl w:val="1"/>
-          <w:numId w:val="2"/>
-        </w:numPr>
-      </w:pPr>
-      <w:r>
-        <w:rPr>
-          <w:i/>
-          <w:iCs/>
-        </w:rPr>
-        <w:t>Shortest Path:</w:t>
-      </w:r>
-      <w:r>
-        <w:t xml:space="preserve"> Path with the minimum total number of intermediate links (hop count).</w:t>
-      </w:r>
-    </w:p>
-    <w:p>
-      <w:pPr>
-        <w:numPr>
-          <w:ilvl w:val="1"/>
-          <w:numId w:val="2"/>
-        </w:numPr>
-      </w:pPr>
-      <w:r>
-        <w:rPr>
-          <w:i/>
-          <w:iCs/>
-        </w:rPr>
-        <w:t>Least-Cost Path:</w:t>
-      </w:r>
-      <w:r>
-        <w:t xml:space="preserve"> Path with the minimum cumulative metric weight across edges.</w:t>
+        <w:t>Router-ID (RID):</w:t>
+      </w:r>
+      <w:r>
+        <w:t xml:space="preserve"> A 32-bit unique IP address (e.g., 1.1.1.1) assigned to identify each router uniquely within an OSPF/IGP domain. Selected via explicit configuration, highest loopback IP, or highest active interface IP.</w:t>
+      </w:r>
+    </w:p>
+    <w:p>
+      <w:r>
+        <w:rPr>
+          <w:b/>
+          <w:bCs/>
+        </w:rPr>
+        <w:t>2. Packet Classification &amp; Functional Breakdown</w:t>
+      </w:r>
+    </w:p>
+    <w:p>
+      <w:r>
+        <w:rPr>
+          <w:b/>
+          <w:bCs/>
+        </w:rPr>
+        <w:t>OSPF Packets</w:t>
       </w:r>
     </w:p>
     <w:p>
       <w:pPr>
         <w:numPr>
           <w:ilvl w:val="0"/>
-          <w:numId w:val="2"/>
+          <w:numId w:val="10"/>
         </w:numPr>
       </w:pPr>
       <w:r>
@@ -391,17 +893,17 @@
           <w:b/>
           <w:bCs/>
         </w:rPr>
-        <w:t>Spanning Trees:</w:t>
-      </w:r>
-      <w:r>
-        <w:t xml:space="preserve"> An acyclic subgraph connecting all network nodes without closed loops. Critical for multicast delivery and preventing broadcast loops.</w:t>
+        <w:t>OSPF Packet Header:</w:t>
+      </w:r>
+      <w:r>
+        <w:t xml:space="preserve"> Common 24-byte header attached to all OSPF packets containing Version, Packet Type, Packet Length, Router ID, Area ID, Checksum, Authentication Type, and Authentication Data.</w:t>
       </w:r>
     </w:p>
     <w:p>
       <w:pPr>
         <w:numPr>
           <w:ilvl w:val="0"/>
-          <w:numId w:val="2"/>
+          <w:numId w:val="10"/>
         </w:numPr>
       </w:pPr>
       <w:r>
@@ -409,50 +911,26 @@
           <w:b/>
           <w:bCs/>
         </w:rPr>
-        <w:t>Articulation Points (Cut Vertices) &amp; Congestion:</w:t>
-      </w:r>
-    </w:p>
-    <w:p>
-      <w:pPr>
-        <w:numPr>
-          <w:ilvl w:val="1"/>
-          <w:numId w:val="2"/>
-        </w:numPr>
-      </w:pPr>
-      <w:r>
-        <w:rPr>
-          <w:i/>
-          <w:iCs/>
-        </w:rPr>
-        <w:t>Articulation Point:</w:t>
-      </w:r>
-      <w:r>
-        <w:t xml:space="preserve"> A router whose removal disconnects a connected graph into two or more isolated subgraphs.</w:t>
-      </w:r>
-    </w:p>
-    <w:p>
-      <w:pPr>
-        <w:numPr>
-          <w:ilvl w:val="1"/>
-          <w:numId w:val="2"/>
-        </w:numPr>
-      </w:pPr>
-      <w:r>
-        <w:rPr>
-          <w:i/>
-          <w:iCs/>
-        </w:rPr>
-        <w:t>Impact:</w:t>
-      </w:r>
-      <w:r>
-        <w:t xml:space="preserve"> Represents a single point of failure and a high-risk bottleneck where traffic congestion accumulates.</w:t>
+        <w:lastRenderedPageBreak/>
+        <w:t>Hello (Type 1):</w:t>
+      </w:r>
+      <w:r>
+        <w:t xml:space="preserve"> Discovers, establishes, and maintains </w:t>
+      </w:r>
+      <w:proofErr w:type="spellStart"/>
+      <w:r>
+        <w:t>neighbor</w:t>
+      </w:r>
+      <w:proofErr w:type="spellEnd"/>
+      <w:r>
+        <w:t xml:space="preserve"> adjacencies. Used for electing Designated Routers (DR) and Backup Designated Routers (BDR) on multi-access networks.</w:t>
       </w:r>
     </w:p>
     <w:p>
       <w:pPr>
         <w:numPr>
           <w:ilvl w:val="0"/>
-          <w:numId w:val="2"/>
+          <w:numId w:val="10"/>
         </w:numPr>
       </w:pPr>
       <w:r>
@@ -460,39 +938,25 @@
           <w:b/>
           <w:bCs/>
         </w:rPr>
-        <w:t>Flow Cuts:</w:t>
-      </w:r>
-      <w:r>
-        <w:t xml:space="preserve"> A partition of network vertices into two disjoint sets </w:t>
-      </w:r>
-      <m:oMath>
-        <m:d>
-          <m:dPr>
-            <m:ctrlPr>
-              <w:rPr>
-                <w:rFonts w:ascii="Cambria Math" w:hAnsi="Cambria Math"/>
-              </w:rPr>
-            </m:ctrlPr>
-          </m:dPr>
-          <m:e>
-            <m:r>
-              <w:rPr>
-                <w:rFonts w:ascii="Cambria Math" w:hAnsi="Cambria Math"/>
-              </w:rPr>
-              <m:t>S,T</m:t>
-            </m:r>
-          </m:e>
-        </m:d>
-      </m:oMath>
-      <w:r>
-        <w:t>. By the Max-Flow Min-Cut Theorem, the minimum-capacity cut bounds the total throughput available between source and destination.</w:t>
+        <w:t>DBD / DDP (Database Description - Type 2):</w:t>
+      </w:r>
+      <w:r>
+        <w:t xml:space="preserve"> Contains summary headers of the LSDB to check database synchronization between </w:t>
+      </w:r>
+      <w:proofErr w:type="spellStart"/>
+      <w:r>
+        <w:t>neighbors</w:t>
+      </w:r>
+      <w:proofErr w:type="spellEnd"/>
+      <w:r>
+        <w:t xml:space="preserve"> during initial adjacency setup.</w:t>
       </w:r>
     </w:p>
     <w:p>
       <w:pPr>
         <w:numPr>
           <w:ilvl w:val="0"/>
-          <w:numId w:val="2"/>
+          <w:numId w:val="10"/>
         </w:numPr>
       </w:pPr>
       <w:r>
@@ -500,884 +964,71 @@
           <w:b/>
           <w:bCs/>
         </w:rPr>
-        <w:t>Priority Queue Implementations in Pathfinding:</w:t>
-      </w:r>
-    </w:p>
-    <w:p>
-      <w:pPr>
-        <w:numPr>
-          <w:ilvl w:val="1"/>
-          <w:numId w:val="2"/>
-        </w:numPr>
-      </w:pPr>
-      <w:r>
-        <w:t>Pathfinding algorithms like Dijkstra's rely on priority queues to pull the unvisited node with the lowest tentative path cost.</w:t>
-      </w:r>
-    </w:p>
-    <w:p>
-      <w:pPr>
-        <w:numPr>
-          <w:ilvl w:val="1"/>
-          <w:numId w:val="2"/>
-        </w:numPr>
-      </w:pPr>
-      <w:r>
-        <w:rPr>
-          <w:i/>
-          <w:iCs/>
-        </w:rPr>
-        <w:t>Binary Min-Heap:</w:t>
-      </w:r>
-      <w:r>
-        <w:t xml:space="preserve"> Provides </w:t>
-      </w:r>
-      <m:oMath>
-        <m:r>
-          <w:rPr>
-            <w:rFonts w:ascii="Cambria Math" w:hAnsi="Cambria Math"/>
-          </w:rPr>
-          <m:t>O</m:t>
-        </m:r>
-        <m:d>
-          <m:dPr>
-            <m:ctrlPr>
-              <w:rPr>
-                <w:rFonts w:ascii="Cambria Math" w:hAnsi="Cambria Math"/>
-              </w:rPr>
-            </m:ctrlPr>
-          </m:dPr>
-          <m:e>
-            <m:d>
-              <m:dPr>
-                <m:ctrlPr>
-                  <w:rPr>
-                    <w:rFonts w:ascii="Cambria Math" w:hAnsi="Cambria Math"/>
-                  </w:rPr>
-                </m:ctrlPr>
-              </m:dPr>
-              <m:e>
-                <m:r>
-                  <w:rPr>
-                    <w:rFonts w:ascii="Cambria Math" w:hAnsi="Cambria Math"/>
-                  </w:rPr>
-                  <m:t>V+E</m:t>
-                </m:r>
-              </m:e>
-            </m:d>
-            <m:func>
-              <m:funcPr>
-                <m:ctrlPr>
-                  <w:rPr>
-                    <w:rFonts w:ascii="Cambria Math" w:hAnsi="Cambria Math"/>
-                  </w:rPr>
-                </m:ctrlPr>
-              </m:funcPr>
-              <m:fName>
-                <m:r>
-                  <m:rPr>
-                    <m:sty m:val="p"/>
-                  </m:rPr>
-                  <w:rPr>
-                    <w:rFonts w:ascii="Cambria Math" w:hAnsi="Cambria Math"/>
-                  </w:rPr>
-                  <m:t>log</m:t>
-                </m:r>
-              </m:fName>
-              <m:e>
-                <m:r>
-                  <w:rPr>
-                    <w:rFonts w:ascii="Cambria Math" w:hAnsi="Cambria Math"/>
-                  </w:rPr>
-                  <m:t>V</m:t>
-                </m:r>
-              </m:e>
-            </m:func>
-          </m:e>
-        </m:d>
-      </m:oMath>
-      <w:r>
-        <w:t xml:space="preserve"> pathfinding runtime.</w:t>
-      </w:r>
-    </w:p>
-    <w:p>
-      <w:pPr>
-        <w:numPr>
-          <w:ilvl w:val="1"/>
-          <w:numId w:val="2"/>
-        </w:numPr>
-      </w:pPr>
-      <w:r>
-        <w:rPr>
-          <w:i/>
-          <w:iCs/>
-        </w:rPr>
-        <w:t>Binomial / Fibonacci Heaps:</w:t>
-      </w:r>
-      <w:r>
-        <w:t xml:space="preserve"> Optimize the Decrease-Key step to </w:t>
-      </w:r>
-      <m:oMath>
-        <m:r>
-          <w:rPr>
-            <w:rFonts w:ascii="Cambria Math" w:hAnsi="Cambria Math"/>
-          </w:rPr>
-          <m:t>O</m:t>
-        </m:r>
-        <m:d>
-          <m:dPr>
-            <m:ctrlPr>
-              <w:rPr>
-                <w:rFonts w:ascii="Cambria Math" w:hAnsi="Cambria Math"/>
-              </w:rPr>
-            </m:ctrlPr>
-          </m:dPr>
-          <m:e>
-            <m:r>
-              <w:rPr>
-                <w:rFonts w:ascii="Cambria Math" w:hAnsi="Cambria Math"/>
-              </w:rPr>
-              <m:t>1</m:t>
-            </m:r>
-          </m:e>
-        </m:d>
-      </m:oMath>
-      <w:r>
-        <w:t xml:space="preserve"> amortized time, reducing algorithm complexity to </w:t>
-      </w:r>
-      <m:oMath>
-        <m:r>
-          <w:rPr>
-            <w:rFonts w:ascii="Cambria Math" w:hAnsi="Cambria Math"/>
-          </w:rPr>
-          <m:t>O</m:t>
-        </m:r>
-        <m:d>
-          <m:dPr>
-            <m:ctrlPr>
-              <w:rPr>
-                <w:rFonts w:ascii="Cambria Math" w:hAnsi="Cambria Math"/>
-              </w:rPr>
-            </m:ctrlPr>
-          </m:dPr>
-          <m:e>
-            <m:r>
-              <w:rPr>
-                <w:rFonts w:ascii="Cambria Math" w:hAnsi="Cambria Math"/>
-              </w:rPr>
-              <m:t>E+V</m:t>
-            </m:r>
-            <m:func>
-              <m:funcPr>
-                <m:ctrlPr>
-                  <w:rPr>
-                    <w:rFonts w:ascii="Cambria Math" w:hAnsi="Cambria Math"/>
-                  </w:rPr>
-                </m:ctrlPr>
-              </m:funcPr>
-              <m:fName>
-                <m:r>
-                  <m:rPr>
-                    <m:sty m:val="p"/>
-                  </m:rPr>
-                  <w:rPr>
-                    <w:rFonts w:ascii="Cambria Math" w:hAnsi="Cambria Math"/>
-                  </w:rPr>
-                  <m:t>log</m:t>
-                </m:r>
-              </m:fName>
-              <m:e>
-                <m:r>
-                  <w:rPr>
-                    <w:rFonts w:ascii="Cambria Math" w:hAnsi="Cambria Math"/>
-                  </w:rPr>
-                  <m:t>V</m:t>
-                </m:r>
-              </m:e>
-            </m:func>
-          </m:e>
-        </m:d>
-      </m:oMath>
-      <w:r>
-        <w:t xml:space="preserve"> for rapid routing updates across large network topologies.</w:t>
-      </w:r>
-    </w:p>
-    <w:p/>
-    <w:p>
-      <w:pPr>
-        <w:rPr>
-          <w:b/>
-          <w:bCs/>
-        </w:rPr>
-      </w:pPr>
-      <w:r>
-        <w:rPr>
-          <w:b/>
-          <w:bCs/>
-        </w:rPr>
-        <w:t>3. Unicast Routing Algorithms &amp; Protocols</w:t>
-      </w:r>
-    </w:p>
-    <w:tbl>
-      <w:tblPr>
-        <w:tblW w:w="0" w:type="auto"/>
-        <w:tblCellSpacing w:w="15" w:type="dxa"/>
-        <w:tblCellMar>
-          <w:left w:w="0" w:type="dxa"/>
-          <w:right w:w="0" w:type="dxa"/>
-        </w:tblCellMar>
-        <w:tblLook w:val="04A0" w:firstRow="1" w:lastRow="0" w:firstColumn="1" w:lastColumn="0" w:noHBand="0" w:noVBand="1"/>
-      </w:tblPr>
-      <w:tblGrid>
-        <w:gridCol w:w="1288"/>
-        <w:gridCol w:w="1668"/>
-        <w:gridCol w:w="1746"/>
-        <w:gridCol w:w="1680"/>
-        <w:gridCol w:w="2628"/>
-      </w:tblGrid>
-      <w:tr>
-        <w:trPr>
-          <w:tblHeader/>
-          <w:tblCellSpacing w:w="15" w:type="dxa"/>
-        </w:trPr>
-        <w:tc>
-          <w:tcPr>
-            <w:tcW w:w="0" w:type="auto"/>
-            <w:tcBorders>
-              <w:top w:val="single" w:sz="6" w:space="0" w:color="C4C7C5"/>
-              <w:left w:val="single" w:sz="6" w:space="0" w:color="C4C7C5"/>
-              <w:bottom w:val="single" w:sz="6" w:space="0" w:color="C4C7C5"/>
-              <w:right w:val="single" w:sz="6" w:space="0" w:color="C4C7C5"/>
-            </w:tcBorders>
-            <w:tcMar>
-              <w:top w:w="120" w:type="dxa"/>
-              <w:left w:w="180" w:type="dxa"/>
-              <w:bottom w:w="120" w:type="dxa"/>
-              <w:right w:w="180" w:type="dxa"/>
-            </w:tcMar>
-            <w:vAlign w:val="center"/>
-            <w:hideMark/>
-          </w:tcPr>
-          <w:p>
-            <w:r>
-              <w:rPr>
-                <w:b/>
-                <w:bCs/>
-              </w:rPr>
-              <w:t>Protocol</w:t>
-            </w:r>
-          </w:p>
-        </w:tc>
-        <w:tc>
-          <w:tcPr>
-            <w:tcW w:w="0" w:type="auto"/>
-            <w:tcBorders>
-              <w:top w:val="single" w:sz="6" w:space="0" w:color="C4C7C5"/>
-              <w:left w:val="single" w:sz="6" w:space="0" w:color="C4C7C5"/>
-              <w:bottom w:val="single" w:sz="6" w:space="0" w:color="C4C7C5"/>
-              <w:right w:val="single" w:sz="6" w:space="0" w:color="C4C7C5"/>
-            </w:tcBorders>
-            <w:tcMar>
-              <w:top w:w="120" w:type="dxa"/>
-              <w:left w:w="180" w:type="dxa"/>
-              <w:bottom w:w="120" w:type="dxa"/>
-              <w:right w:w="180" w:type="dxa"/>
-            </w:tcMar>
-            <w:vAlign w:val="center"/>
-            <w:hideMark/>
-          </w:tcPr>
-          <w:p>
-            <w:r>
-              <w:rPr>
-                <w:b/>
-                <w:bCs/>
-              </w:rPr>
-              <w:t>Underlying Algorithm</w:t>
-            </w:r>
-          </w:p>
-        </w:tc>
-        <w:tc>
-          <w:tcPr>
-            <w:tcW w:w="0" w:type="auto"/>
-            <w:tcBorders>
-              <w:top w:val="single" w:sz="6" w:space="0" w:color="C4C7C5"/>
-              <w:left w:val="single" w:sz="6" w:space="0" w:color="C4C7C5"/>
-              <w:bottom w:val="single" w:sz="6" w:space="0" w:color="C4C7C5"/>
-              <w:right w:val="single" w:sz="6" w:space="0" w:color="C4C7C5"/>
-            </w:tcBorders>
-            <w:tcMar>
-              <w:top w:w="120" w:type="dxa"/>
-              <w:left w:w="180" w:type="dxa"/>
-              <w:bottom w:w="120" w:type="dxa"/>
-              <w:right w:w="180" w:type="dxa"/>
-            </w:tcMar>
-            <w:vAlign w:val="center"/>
-            <w:hideMark/>
-          </w:tcPr>
-          <w:p>
-            <w:r>
-              <w:rPr>
-                <w:b/>
-                <w:bCs/>
-              </w:rPr>
-              <w:t>Type</w:t>
-            </w:r>
-          </w:p>
-        </w:tc>
-        <w:tc>
-          <w:tcPr>
-            <w:tcW w:w="0" w:type="auto"/>
-            <w:tcBorders>
-              <w:top w:val="single" w:sz="6" w:space="0" w:color="C4C7C5"/>
-              <w:left w:val="single" w:sz="6" w:space="0" w:color="C4C7C5"/>
-              <w:bottom w:val="single" w:sz="6" w:space="0" w:color="C4C7C5"/>
-              <w:right w:val="single" w:sz="6" w:space="0" w:color="C4C7C5"/>
-            </w:tcBorders>
-            <w:tcMar>
-              <w:top w:w="120" w:type="dxa"/>
-              <w:left w:w="180" w:type="dxa"/>
-              <w:bottom w:w="120" w:type="dxa"/>
-              <w:right w:w="180" w:type="dxa"/>
-            </w:tcMar>
-            <w:vAlign w:val="center"/>
-            <w:hideMark/>
-          </w:tcPr>
-          <w:p>
-            <w:r>
-              <w:rPr>
-                <w:b/>
-                <w:bCs/>
-              </w:rPr>
-              <w:t>Primary Metric</w:t>
-            </w:r>
-          </w:p>
-        </w:tc>
-        <w:tc>
-          <w:tcPr>
-            <w:tcW w:w="0" w:type="auto"/>
-            <w:tcBorders>
-              <w:top w:val="single" w:sz="6" w:space="0" w:color="C4C7C5"/>
-              <w:left w:val="single" w:sz="6" w:space="0" w:color="C4C7C5"/>
-              <w:bottom w:val="single" w:sz="6" w:space="0" w:color="C4C7C5"/>
-              <w:right w:val="single" w:sz="6" w:space="0" w:color="C4C7C5"/>
-            </w:tcBorders>
-            <w:tcMar>
-              <w:top w:w="120" w:type="dxa"/>
-              <w:left w:w="180" w:type="dxa"/>
-              <w:bottom w:w="120" w:type="dxa"/>
-              <w:right w:w="180" w:type="dxa"/>
-            </w:tcMar>
-            <w:vAlign w:val="center"/>
-            <w:hideMark/>
-          </w:tcPr>
-          <w:p>
-            <w:r>
-              <w:rPr>
-                <w:b/>
-                <w:bCs/>
-              </w:rPr>
-              <w:t>Core Feature / Mechanism</w:t>
-            </w:r>
-          </w:p>
-        </w:tc>
-      </w:tr>
-      <w:tr>
-        <w:trPr>
-          <w:tblCellSpacing w:w="15" w:type="dxa"/>
-        </w:trPr>
-        <w:tc>
-          <w:tcPr>
-            <w:tcW w:w="0" w:type="auto"/>
-            <w:tcBorders>
-              <w:top w:val="single" w:sz="6" w:space="0" w:color="C4C7C5"/>
-              <w:left w:val="single" w:sz="6" w:space="0" w:color="C4C7C5"/>
-              <w:bottom w:val="single" w:sz="6" w:space="0" w:color="C4C7C5"/>
-              <w:right w:val="single" w:sz="6" w:space="0" w:color="C4C7C5"/>
-            </w:tcBorders>
-            <w:tcMar>
-              <w:top w:w="120" w:type="dxa"/>
-              <w:left w:w="180" w:type="dxa"/>
-              <w:bottom w:w="120" w:type="dxa"/>
-              <w:right w:w="180" w:type="dxa"/>
-            </w:tcMar>
-            <w:vAlign w:val="center"/>
-            <w:hideMark/>
-          </w:tcPr>
-          <w:p>
-            <w:r>
-              <w:rPr>
-                <w:b/>
-                <w:bCs/>
-              </w:rPr>
-              <w:t>RIP</w:t>
-            </w:r>
-          </w:p>
-        </w:tc>
-        <w:tc>
-          <w:tcPr>
-            <w:tcW w:w="0" w:type="auto"/>
-            <w:tcBorders>
-              <w:top w:val="single" w:sz="6" w:space="0" w:color="C4C7C5"/>
-              <w:left w:val="single" w:sz="6" w:space="0" w:color="C4C7C5"/>
-              <w:bottom w:val="single" w:sz="6" w:space="0" w:color="C4C7C5"/>
-              <w:right w:val="single" w:sz="6" w:space="0" w:color="C4C7C5"/>
-            </w:tcBorders>
-            <w:tcMar>
-              <w:top w:w="120" w:type="dxa"/>
-              <w:left w:w="180" w:type="dxa"/>
-              <w:bottom w:w="120" w:type="dxa"/>
-              <w:right w:w="180" w:type="dxa"/>
-            </w:tcMar>
-            <w:vAlign w:val="center"/>
-            <w:hideMark/>
-          </w:tcPr>
-          <w:p>
-            <w:r>
-              <w:t>Bellman-Ford (Distance Vector)</w:t>
-            </w:r>
-          </w:p>
-        </w:tc>
-        <w:tc>
-          <w:tcPr>
-            <w:tcW w:w="0" w:type="auto"/>
-            <w:tcBorders>
-              <w:top w:val="single" w:sz="6" w:space="0" w:color="C4C7C5"/>
-              <w:left w:val="single" w:sz="6" w:space="0" w:color="C4C7C5"/>
-              <w:bottom w:val="single" w:sz="6" w:space="0" w:color="C4C7C5"/>
-              <w:right w:val="single" w:sz="6" w:space="0" w:color="C4C7C5"/>
-            </w:tcBorders>
-            <w:tcMar>
-              <w:top w:w="120" w:type="dxa"/>
-              <w:left w:w="180" w:type="dxa"/>
-              <w:bottom w:w="120" w:type="dxa"/>
-              <w:right w:w="180" w:type="dxa"/>
-            </w:tcMar>
-            <w:vAlign w:val="center"/>
-            <w:hideMark/>
-          </w:tcPr>
-          <w:p>
-            <w:r>
-              <w:t>IGP (Intradomain)</w:t>
-            </w:r>
-          </w:p>
-        </w:tc>
-        <w:tc>
-          <w:tcPr>
-            <w:tcW w:w="0" w:type="auto"/>
-            <w:tcBorders>
-              <w:top w:val="single" w:sz="6" w:space="0" w:color="C4C7C5"/>
-              <w:left w:val="single" w:sz="6" w:space="0" w:color="C4C7C5"/>
-              <w:bottom w:val="single" w:sz="6" w:space="0" w:color="C4C7C5"/>
-              <w:right w:val="single" w:sz="6" w:space="0" w:color="C4C7C5"/>
-            </w:tcBorders>
-            <w:tcMar>
-              <w:top w:w="120" w:type="dxa"/>
-              <w:left w:w="180" w:type="dxa"/>
-              <w:bottom w:w="120" w:type="dxa"/>
-              <w:right w:w="180" w:type="dxa"/>
-            </w:tcMar>
-            <w:vAlign w:val="center"/>
-            <w:hideMark/>
-          </w:tcPr>
-          <w:p>
-            <w:r>
-              <w:t>Hop count (Max 15)</w:t>
-            </w:r>
-          </w:p>
-        </w:tc>
-        <w:tc>
-          <w:tcPr>
-            <w:tcW w:w="0" w:type="auto"/>
-            <w:tcBorders>
-              <w:top w:val="single" w:sz="6" w:space="0" w:color="C4C7C5"/>
-              <w:left w:val="single" w:sz="6" w:space="0" w:color="C4C7C5"/>
-              <w:bottom w:val="single" w:sz="6" w:space="0" w:color="C4C7C5"/>
-              <w:right w:val="single" w:sz="6" w:space="0" w:color="C4C7C5"/>
-            </w:tcBorders>
-            <w:tcMar>
-              <w:top w:w="120" w:type="dxa"/>
-              <w:left w:w="180" w:type="dxa"/>
-              <w:bottom w:w="120" w:type="dxa"/>
-              <w:right w:w="180" w:type="dxa"/>
-            </w:tcMar>
-            <w:vAlign w:val="center"/>
-            <w:hideMark/>
-          </w:tcPr>
-          <w:p>
-            <w:r>
-              <w:t xml:space="preserve">Asynchronous periodic updates sent strictly to direct </w:t>
-            </w:r>
-            <w:proofErr w:type="spellStart"/>
-            <w:r>
-              <w:t>neighbors</w:t>
-            </w:r>
-            <w:proofErr w:type="spellEnd"/>
-            <w:r>
-              <w:t>. Prone to Count-to-Infinity.</w:t>
-            </w:r>
-          </w:p>
-        </w:tc>
-      </w:tr>
-      <w:tr>
-        <w:trPr>
-          <w:tblCellSpacing w:w="15" w:type="dxa"/>
-        </w:trPr>
-        <w:tc>
-          <w:tcPr>
-            <w:tcW w:w="0" w:type="auto"/>
-            <w:tcBorders>
-              <w:top w:val="single" w:sz="6" w:space="0" w:color="C4C7C5"/>
-              <w:left w:val="single" w:sz="6" w:space="0" w:color="C4C7C5"/>
-              <w:bottom w:val="single" w:sz="6" w:space="0" w:color="C4C7C5"/>
-              <w:right w:val="single" w:sz="6" w:space="0" w:color="C4C7C5"/>
-            </w:tcBorders>
-            <w:tcMar>
-              <w:top w:w="120" w:type="dxa"/>
-              <w:left w:w="180" w:type="dxa"/>
-              <w:bottom w:w="120" w:type="dxa"/>
-              <w:right w:w="180" w:type="dxa"/>
-            </w:tcMar>
-            <w:vAlign w:val="center"/>
-            <w:hideMark/>
-          </w:tcPr>
-          <w:p>
-            <w:r>
-              <w:rPr>
-                <w:b/>
-                <w:bCs/>
-              </w:rPr>
-              <w:lastRenderedPageBreak/>
-              <w:t>OSPF</w:t>
-            </w:r>
-          </w:p>
-        </w:tc>
-        <w:tc>
-          <w:tcPr>
-            <w:tcW w:w="0" w:type="auto"/>
-            <w:tcBorders>
-              <w:top w:val="single" w:sz="6" w:space="0" w:color="C4C7C5"/>
-              <w:left w:val="single" w:sz="6" w:space="0" w:color="C4C7C5"/>
-              <w:bottom w:val="single" w:sz="6" w:space="0" w:color="C4C7C5"/>
-              <w:right w:val="single" w:sz="6" w:space="0" w:color="C4C7C5"/>
-            </w:tcBorders>
-            <w:tcMar>
-              <w:top w:w="120" w:type="dxa"/>
-              <w:left w:w="180" w:type="dxa"/>
-              <w:bottom w:w="120" w:type="dxa"/>
-              <w:right w:w="180" w:type="dxa"/>
-            </w:tcMar>
-            <w:vAlign w:val="center"/>
-            <w:hideMark/>
-          </w:tcPr>
-          <w:p>
-            <w:r>
-              <w:t>Dijkstra (Link-State)</w:t>
-            </w:r>
-          </w:p>
-        </w:tc>
-        <w:tc>
-          <w:tcPr>
-            <w:tcW w:w="0" w:type="auto"/>
-            <w:tcBorders>
-              <w:top w:val="single" w:sz="6" w:space="0" w:color="C4C7C5"/>
-              <w:left w:val="single" w:sz="6" w:space="0" w:color="C4C7C5"/>
-              <w:bottom w:val="single" w:sz="6" w:space="0" w:color="C4C7C5"/>
-              <w:right w:val="single" w:sz="6" w:space="0" w:color="C4C7C5"/>
-            </w:tcBorders>
-            <w:tcMar>
-              <w:top w:w="120" w:type="dxa"/>
-              <w:left w:w="180" w:type="dxa"/>
-              <w:bottom w:w="120" w:type="dxa"/>
-              <w:right w:w="180" w:type="dxa"/>
-            </w:tcMar>
-            <w:vAlign w:val="center"/>
-            <w:hideMark/>
-          </w:tcPr>
-          <w:p>
-            <w:r>
-              <w:t>IGP (Intradomain)</w:t>
-            </w:r>
-          </w:p>
-        </w:tc>
-        <w:tc>
-          <w:tcPr>
-            <w:tcW w:w="0" w:type="auto"/>
-            <w:tcBorders>
-              <w:top w:val="single" w:sz="6" w:space="0" w:color="C4C7C5"/>
-              <w:left w:val="single" w:sz="6" w:space="0" w:color="C4C7C5"/>
-              <w:bottom w:val="single" w:sz="6" w:space="0" w:color="C4C7C5"/>
-              <w:right w:val="single" w:sz="6" w:space="0" w:color="C4C7C5"/>
-            </w:tcBorders>
-            <w:tcMar>
-              <w:top w:w="120" w:type="dxa"/>
-              <w:left w:w="180" w:type="dxa"/>
-              <w:bottom w:w="120" w:type="dxa"/>
-              <w:right w:w="180" w:type="dxa"/>
-            </w:tcMar>
-            <w:vAlign w:val="center"/>
-            <w:hideMark/>
-          </w:tcPr>
-          <w:p>
-            <w:r>
-              <w:t>Cost (Bandwidth-based)</w:t>
-            </w:r>
-          </w:p>
-        </w:tc>
-        <w:tc>
-          <w:tcPr>
-            <w:tcW w:w="0" w:type="auto"/>
-            <w:tcBorders>
-              <w:top w:val="single" w:sz="6" w:space="0" w:color="C4C7C5"/>
-              <w:left w:val="single" w:sz="6" w:space="0" w:color="C4C7C5"/>
-              <w:bottom w:val="single" w:sz="6" w:space="0" w:color="C4C7C5"/>
-              <w:right w:val="single" w:sz="6" w:space="0" w:color="C4C7C5"/>
-            </w:tcBorders>
-            <w:tcMar>
-              <w:top w:w="120" w:type="dxa"/>
-              <w:left w:w="180" w:type="dxa"/>
-              <w:bottom w:w="120" w:type="dxa"/>
-              <w:right w:w="180" w:type="dxa"/>
-            </w:tcMar>
-            <w:vAlign w:val="center"/>
-            <w:hideMark/>
-          </w:tcPr>
-          <w:p>
-            <w:r>
-              <w:t>LSAs flooded network-wide to build a global Link-State Database (LSDB). Uses Areas for hierarchy.</w:t>
-            </w:r>
-          </w:p>
-        </w:tc>
-      </w:tr>
-      <w:tr>
-        <w:trPr>
-          <w:tblCellSpacing w:w="15" w:type="dxa"/>
-        </w:trPr>
-        <w:tc>
-          <w:tcPr>
-            <w:tcW w:w="0" w:type="auto"/>
-            <w:tcBorders>
-              <w:top w:val="single" w:sz="6" w:space="0" w:color="C4C7C5"/>
-              <w:left w:val="single" w:sz="6" w:space="0" w:color="C4C7C5"/>
-              <w:bottom w:val="single" w:sz="6" w:space="0" w:color="C4C7C5"/>
-              <w:right w:val="single" w:sz="6" w:space="0" w:color="C4C7C5"/>
-            </w:tcBorders>
-            <w:tcMar>
-              <w:top w:w="120" w:type="dxa"/>
-              <w:left w:w="180" w:type="dxa"/>
-              <w:bottom w:w="120" w:type="dxa"/>
-              <w:right w:w="180" w:type="dxa"/>
-            </w:tcMar>
-            <w:vAlign w:val="center"/>
-            <w:hideMark/>
-          </w:tcPr>
-          <w:p>
-            <w:r>
-              <w:rPr>
-                <w:b/>
-                <w:bCs/>
-              </w:rPr>
-              <w:t>BGP-4</w:t>
-            </w:r>
-          </w:p>
-        </w:tc>
-        <w:tc>
-          <w:tcPr>
-            <w:tcW w:w="0" w:type="auto"/>
-            <w:tcBorders>
-              <w:top w:val="single" w:sz="6" w:space="0" w:color="C4C7C5"/>
-              <w:left w:val="single" w:sz="6" w:space="0" w:color="C4C7C5"/>
-              <w:bottom w:val="single" w:sz="6" w:space="0" w:color="C4C7C5"/>
-              <w:right w:val="single" w:sz="6" w:space="0" w:color="C4C7C5"/>
-            </w:tcBorders>
-            <w:tcMar>
-              <w:top w:w="120" w:type="dxa"/>
-              <w:left w:w="180" w:type="dxa"/>
-              <w:bottom w:w="120" w:type="dxa"/>
-              <w:right w:w="180" w:type="dxa"/>
-            </w:tcMar>
-            <w:vAlign w:val="center"/>
-            <w:hideMark/>
-          </w:tcPr>
-          <w:p>
-            <w:r>
-              <w:t>Path Vector Algorithm</w:t>
-            </w:r>
-          </w:p>
-        </w:tc>
-        <w:tc>
-          <w:tcPr>
-            <w:tcW w:w="0" w:type="auto"/>
-            <w:tcBorders>
-              <w:top w:val="single" w:sz="6" w:space="0" w:color="C4C7C5"/>
-              <w:left w:val="single" w:sz="6" w:space="0" w:color="C4C7C5"/>
-              <w:bottom w:val="single" w:sz="6" w:space="0" w:color="C4C7C5"/>
-              <w:right w:val="single" w:sz="6" w:space="0" w:color="C4C7C5"/>
-            </w:tcBorders>
-            <w:tcMar>
-              <w:top w:w="120" w:type="dxa"/>
-              <w:left w:w="180" w:type="dxa"/>
-              <w:bottom w:w="120" w:type="dxa"/>
-              <w:right w:w="180" w:type="dxa"/>
-            </w:tcMar>
-            <w:vAlign w:val="center"/>
-            <w:hideMark/>
-          </w:tcPr>
-          <w:p>
-            <w:r>
-              <w:t>EGP (Interdomain)</w:t>
-            </w:r>
-          </w:p>
-        </w:tc>
-        <w:tc>
-          <w:tcPr>
-            <w:tcW w:w="0" w:type="auto"/>
-            <w:tcBorders>
-              <w:top w:val="single" w:sz="6" w:space="0" w:color="C4C7C5"/>
-              <w:left w:val="single" w:sz="6" w:space="0" w:color="C4C7C5"/>
-              <w:bottom w:val="single" w:sz="6" w:space="0" w:color="C4C7C5"/>
-              <w:right w:val="single" w:sz="6" w:space="0" w:color="C4C7C5"/>
-            </w:tcBorders>
-            <w:tcMar>
-              <w:top w:w="120" w:type="dxa"/>
-              <w:left w:w="180" w:type="dxa"/>
-              <w:bottom w:w="120" w:type="dxa"/>
-              <w:right w:w="180" w:type="dxa"/>
-            </w:tcMar>
-            <w:vAlign w:val="center"/>
-            <w:hideMark/>
-          </w:tcPr>
-          <w:p>
-            <w:r>
-              <w:t>Path Attributes / Policies</w:t>
-            </w:r>
-          </w:p>
-        </w:tc>
-        <w:tc>
-          <w:tcPr>
-            <w:tcW w:w="0" w:type="auto"/>
-            <w:tcBorders>
-              <w:top w:val="single" w:sz="6" w:space="0" w:color="C4C7C5"/>
-              <w:left w:val="single" w:sz="6" w:space="0" w:color="C4C7C5"/>
-              <w:bottom w:val="single" w:sz="6" w:space="0" w:color="C4C7C5"/>
-              <w:right w:val="single" w:sz="6" w:space="0" w:color="C4C7C5"/>
-            </w:tcBorders>
-            <w:tcMar>
-              <w:top w:w="120" w:type="dxa"/>
-              <w:left w:w="180" w:type="dxa"/>
-              <w:bottom w:w="120" w:type="dxa"/>
-              <w:right w:w="180" w:type="dxa"/>
-            </w:tcMar>
-            <w:vAlign w:val="center"/>
-            <w:hideMark/>
-          </w:tcPr>
-          <w:p>
-            <w:r>
-              <w:t>Passes complete list of visited Autonomous Systems (AS-Path) to eliminate loops and enforce administrative policies.</w:t>
-            </w:r>
-          </w:p>
-        </w:tc>
-      </w:tr>
-    </w:tbl>
-    <w:p>
-      <w:pPr>
-        <w:rPr>
-          <w:b/>
-          <w:bCs/>
-        </w:rPr>
-      </w:pPr>
-      <w:r>
-        <w:rPr>
-          <w:b/>
-          <w:bCs/>
-        </w:rPr>
-        <w:t>Distance Vector &amp; Bellman-Ford Rules</w:t>
+        <w:t>LSR (Link-State Request - Type 3):</w:t>
+      </w:r>
+      <w:r>
+        <w:t xml:space="preserve"> Sent by a router to request detailed information about specific Link-State Advertisements (LSAs) missing from its LSDB.</w:t>
       </w:r>
     </w:p>
     <w:p>
       <w:pPr>
         <w:numPr>
           <w:ilvl w:val="0"/>
-          <w:numId w:val="3"/>
+          <w:numId w:val="10"/>
         </w:numPr>
       </w:pPr>
       <w:r>
-        <w:t xml:space="preserve">Each router maintains three primary pieces of information per route: </w:t>
-      </w:r>
-      <w:r>
-        <w:rPr>
-          <w:b/>
-          <w:bCs/>
-        </w:rPr>
-        <w:t>Destination Network</w:t>
-      </w:r>
-      <w:r>
-        <w:t xml:space="preserve">, </w:t>
-      </w:r>
-      <w:r>
-        <w:rPr>
-          <w:b/>
-          <w:bCs/>
-        </w:rPr>
-        <w:t>Cost</w:t>
-      </w:r>
-      <w:r>
-        <w:t xml:space="preserve">, and </w:t>
-      </w:r>
-      <w:r>
-        <w:rPr>
-          <w:b/>
-          <w:bCs/>
-        </w:rPr>
-        <w:t>Next Hop</w:t>
-      </w:r>
-      <w:r>
-        <w:t>.</w:t>
+        <w:rPr>
+          <w:b/>
+          <w:bCs/>
+        </w:rPr>
+        <w:t>LSU (Link-State Update - Type 4):</w:t>
+      </w:r>
+      <w:r>
+        <w:t xml:space="preserve"> Carries the actual detailed LSAs to update adjacent routers' databases.</w:t>
       </w:r>
     </w:p>
     <w:p>
       <w:pPr>
         <w:numPr>
           <w:ilvl w:val="0"/>
-          <w:numId w:val="3"/>
+          <w:numId w:val="10"/>
         </w:numPr>
       </w:pPr>
-      <w:r>
-        <w:t xml:space="preserve">Routers share two pieces of information with </w:t>
-      </w:r>
       <w:proofErr w:type="spellStart"/>
       <w:r>
-        <w:t>neighbors</w:t>
+        <w:rPr>
+          <w:b/>
+          <w:bCs/>
+        </w:rPr>
+        <w:t>LSAck</w:t>
       </w:r>
       <w:proofErr w:type="spellEnd"/>
       <w:r>
-        <w:t xml:space="preserve"> during updates: </w:t>
-      </w:r>
-      <w:r>
-        <w:rPr>
-          <w:b/>
-          <w:bCs/>
-        </w:rPr>
-        <w:t>Destination Network</w:t>
-      </w:r>
-      <w:r>
-        <w:t xml:space="preserve"> and </w:t>
-      </w:r>
-      <w:r>
-        <w:rPr>
-          <w:b/>
-          <w:bCs/>
-        </w:rPr>
-        <w:t>Cost</w:t>
-      </w:r>
-      <w:r>
-        <w:t>.</w:t>
-      </w:r>
-    </w:p>
-    <w:p/>
+        <w:rPr>
+          <w:b/>
+          <w:bCs/>
+        </w:rPr>
+        <w:t xml:space="preserve"> (Link-State Acknowledgment - Type 5):</w:t>
+      </w:r>
+      <w:r>
+        <w:t xml:space="preserve"> Explicitly acknowledges receipt of LSU packets to ensure reliable transmission.</w:t>
+      </w:r>
+    </w:p>
+    <w:p>
+      <w:r>
+        <w:rPr>
+          <w:b/>
+          <w:bCs/>
+        </w:rPr>
+        <w:t>IS-IS Packets (Intermediate System to Intermediate System)</w:t>
+      </w:r>
+    </w:p>
     <w:p>
       <w:pPr>
         <w:numPr>
           <w:ilvl w:val="0"/>
-          <w:numId w:val="3"/>
+          <w:numId w:val="11"/>
         </w:numPr>
       </w:pPr>
       <w:r>
@@ -1385,193 +1036,25 @@
           <w:b/>
           <w:bCs/>
         </w:rPr>
-        <w:t>Bellman-Ford Equation:</w:t>
-      </w:r>
-    </w:p>
-    <w:p>
-      <m:oMathPara>
-        <m:oMath>
-          <m:sSub>
-            <m:sSubPr>
-              <m:ctrlPr>
-                <w:rPr>
-                  <w:rFonts w:ascii="Cambria Math" w:hAnsi="Cambria Math"/>
-                </w:rPr>
-              </m:ctrlPr>
-            </m:sSubPr>
-            <m:e>
-              <m:r>
-                <w:rPr>
-                  <w:rFonts w:ascii="Cambria Math" w:hAnsi="Cambria Math"/>
-                </w:rPr>
-                <m:t>D</m:t>
-              </m:r>
-            </m:e>
-            <m:sub>
-              <m:r>
-                <w:rPr>
-                  <w:rFonts w:ascii="Cambria Math" w:hAnsi="Cambria Math"/>
-                </w:rPr>
-                <m:t>i</m:t>
-              </m:r>
-            </m:sub>
-          </m:sSub>
-          <m:d>
-            <m:dPr>
-              <m:ctrlPr>
-                <w:rPr>
-                  <w:rFonts w:ascii="Cambria Math" w:hAnsi="Cambria Math"/>
-                </w:rPr>
-              </m:ctrlPr>
-            </m:dPr>
-            <m:e>
-              <m:r>
-                <w:rPr>
-                  <w:rFonts w:ascii="Cambria Math" w:hAnsi="Cambria Math"/>
-                </w:rPr>
-                <m:t>j</m:t>
-              </m:r>
-            </m:e>
-          </m:d>
-          <m:r>
-            <w:rPr>
-              <w:rFonts w:ascii="Cambria Math" w:hAnsi="Cambria Math"/>
-            </w:rPr>
-            <m:t>=</m:t>
-          </m:r>
-          <m:func>
-            <m:funcPr>
-              <m:ctrlPr>
-                <w:rPr>
-                  <w:rFonts w:ascii="Cambria Math" w:hAnsi="Cambria Math"/>
-                </w:rPr>
-              </m:ctrlPr>
-            </m:funcPr>
-            <m:fName>
-              <m:limLow>
-                <m:limLowPr>
-                  <m:ctrlPr>
-                    <w:rPr>
-                      <w:rFonts w:ascii="Cambria Math" w:hAnsi="Cambria Math"/>
-                    </w:rPr>
-                  </m:ctrlPr>
-                </m:limLowPr>
-                <m:e>
-                  <m:r>
-                    <m:rPr>
-                      <m:sty m:val="p"/>
-                    </m:rPr>
-                    <w:rPr>
-                      <w:rFonts w:ascii="Cambria Math" w:hAnsi="Cambria Math"/>
-                    </w:rPr>
-                    <m:t>min</m:t>
-                  </m:r>
-                </m:e>
-                <m:lim>
-                  <m:r>
-                    <w:rPr>
-                      <w:rFonts w:ascii="Cambria Math" w:hAnsi="Cambria Math"/>
-                    </w:rPr>
-                    <m:t>k</m:t>
-                  </m:r>
-                </m:lim>
-              </m:limLow>
-            </m:fName>
-            <m:e>
-              <m:d>
-                <m:dPr>
-                  <m:begChr m:val="{"/>
-                  <m:endChr m:val="}"/>
-                  <m:ctrlPr>
-                    <w:rPr>
-                      <w:rFonts w:ascii="Cambria Math" w:hAnsi="Cambria Math"/>
-                    </w:rPr>
-                  </m:ctrlPr>
-                </m:dPr>
-                <m:e>
-                  <m:r>
-                    <w:rPr>
-                      <w:rFonts w:ascii="Cambria Math" w:hAnsi="Cambria Math"/>
-                    </w:rPr>
-                    <m:t>c</m:t>
-                  </m:r>
-                  <m:d>
-                    <m:dPr>
-                      <m:ctrlPr>
-                        <w:rPr>
-                          <w:rFonts w:ascii="Cambria Math" w:hAnsi="Cambria Math"/>
-                        </w:rPr>
-                      </m:ctrlPr>
-                    </m:dPr>
-                    <m:e>
-                      <m:r>
-                        <w:rPr>
-                          <w:rFonts w:ascii="Cambria Math" w:hAnsi="Cambria Math"/>
-                        </w:rPr>
-                        <m:t>i,k</m:t>
-                      </m:r>
-                    </m:e>
-                  </m:d>
-                  <m:r>
-                    <w:rPr>
-                      <w:rFonts w:ascii="Cambria Math" w:hAnsi="Cambria Math"/>
-                    </w:rPr>
-                    <m:t>+</m:t>
-                  </m:r>
-                  <m:sSub>
-                    <m:sSubPr>
-                      <m:ctrlPr>
-                        <w:rPr>
-                          <w:rFonts w:ascii="Cambria Math" w:hAnsi="Cambria Math"/>
-                        </w:rPr>
-                      </m:ctrlPr>
-                    </m:sSubPr>
-                    <m:e>
-                      <m:r>
-                        <w:rPr>
-                          <w:rFonts w:ascii="Cambria Math" w:hAnsi="Cambria Math"/>
-                        </w:rPr>
-                        <m:t>D</m:t>
-                      </m:r>
-                    </m:e>
-                    <m:sub>
-                      <m:r>
-                        <w:rPr>
-                          <w:rFonts w:ascii="Cambria Math" w:hAnsi="Cambria Math"/>
-                        </w:rPr>
-                        <m:t>k</m:t>
-                      </m:r>
-                    </m:sub>
-                  </m:sSub>
-                  <m:d>
-                    <m:dPr>
-                      <m:ctrlPr>
-                        <w:rPr>
-                          <w:rFonts w:ascii="Cambria Math" w:hAnsi="Cambria Math"/>
-                        </w:rPr>
-                      </m:ctrlPr>
-                    </m:dPr>
-                    <m:e>
-                      <m:r>
-                        <w:rPr>
-                          <w:rFonts w:ascii="Cambria Math" w:hAnsi="Cambria Math"/>
-                        </w:rPr>
-                        <m:t>j</m:t>
-                      </m:r>
-                    </m:e>
-                  </m:d>
-                </m:e>
-              </m:d>
-            </m:e>
-          </m:func>
-        </m:oMath>
-      </m:oMathPara>
+        <w:t>IIH (IS-IS Hello):</w:t>
+      </w:r>
+      <w:r>
+        <w:t xml:space="preserve"> Used to establish and maintain adjacencies between </w:t>
+      </w:r>
+      <w:proofErr w:type="spellStart"/>
+      <w:r>
+        <w:t>neighboring</w:t>
+      </w:r>
+      <w:proofErr w:type="spellEnd"/>
+      <w:r>
+        <w:t xml:space="preserve"> IS-IS systems.</w:t>
+      </w:r>
     </w:p>
     <w:p>
       <w:pPr>
         <w:numPr>
           <w:ilvl w:val="0"/>
-          <w:numId w:val="3"/>
+          <w:numId w:val="11"/>
         </w:numPr>
       </w:pPr>
       <w:r>
@@ -1579,68 +1062,17 @@
           <w:b/>
           <w:bCs/>
         </w:rPr>
-        <w:t>Table Update Rules:</w:t>
-      </w:r>
-    </w:p>
-    <w:p>
-      <w:pPr>
-        <w:numPr>
-          <w:ilvl w:val="1"/>
-          <w:numId w:val="3"/>
-        </w:numPr>
-      </w:pPr>
-      <w:r>
-        <w:t xml:space="preserve">If a received route cost </w:t>
-      </w:r>
-      <m:oMath>
-        <m:r>
-          <w:rPr>
-            <w:rFonts w:ascii="Cambria Math" w:hAnsi="Cambria Math"/>
-          </w:rPr>
-          <m:t>+</m:t>
-        </m:r>
-        <m:r>
-          <m:rPr>
-            <m:nor/>
-          </m:rPr>
-          <m:t>link cost</m:t>
-        </m:r>
-      </m:oMath>
-      <w:r>
-        <w:t xml:space="preserve"> is lower than the current stored cost, update the routing entry.</w:t>
-      </w:r>
-    </w:p>
-    <w:p>
-      <w:pPr>
-        <w:numPr>
-          <w:ilvl w:val="1"/>
-          <w:numId w:val="3"/>
-        </w:numPr>
-      </w:pPr>
-      <w:r>
-        <w:t>If an update comes from the existing next-hop router, update the routing table unconditionally to adapt to performance/topology changes.</w:t>
-      </w:r>
-    </w:p>
-    <w:p>
-      <w:pPr>
-        <w:rPr>
-          <w:b/>
-          <w:bCs/>
-        </w:rPr>
-      </w:pPr>
-      <w:r>
-        <w:rPr>
-          <w:b/>
-          <w:bCs/>
-        </w:rPr>
-        <w:t>4. Multicast Routing Protocols &amp; Group Management</w:t>
+        <w:t>LSP (Link State PDU):</w:t>
+      </w:r>
+      <w:r>
+        <w:t xml:space="preserve"> Equivalent to OSPF's LSU; carries actual link-state topology information across the domain.</w:t>
       </w:r>
     </w:p>
     <w:p>
       <w:pPr>
         <w:numPr>
           <w:ilvl w:val="0"/>
-          <w:numId w:val="4"/>
+          <w:numId w:val="11"/>
         </w:numPr>
       </w:pPr>
       <w:r>
@@ -1648,17 +1080,17 @@
           <w:b/>
           <w:bCs/>
         </w:rPr>
-        <w:t>Multicast Communication:</w:t>
-      </w:r>
-      <w:r>
-        <w:t xml:space="preserve"> One-to-many distribution where traffic is replicated only at network branching points to deliver data efficiently to multiple targets without redundant transmission.</w:t>
+        <w:t>CSNP (Complete Sequence Number PDU):</w:t>
+      </w:r>
+      <w:r>
+        <w:t xml:space="preserve"> Equivalent to OSPF's DBD; contains a complete summary list of all LSPs in the LSDB for periodic synchronization.</w:t>
       </w:r>
     </w:p>
     <w:p>
       <w:pPr>
         <w:numPr>
           <w:ilvl w:val="0"/>
-          <w:numId w:val="4"/>
+          <w:numId w:val="11"/>
         </w:numPr>
       </w:pPr>
       <w:r>
@@ -1666,153 +1098,18 @@
           <w:b/>
           <w:bCs/>
         </w:rPr>
-        <w:t>IGMP (v2/v3):</w:t>
-      </w:r>
-      <w:r>
-        <w:t xml:space="preserve"> Host-to-router protocol enabling hosts to inform local subnet routers when joining or leaving specific multicast groups (Class D IP addressing).</w:t>
-      </w:r>
-    </w:p>
-    <w:p>
-      <w:pPr>
-        <w:numPr>
-          <w:ilvl w:val="0"/>
-          <w:numId w:val="4"/>
-        </w:numPr>
-      </w:pPr>
-      <w:r>
-        <w:rPr>
-          <w:b/>
-          <w:bCs/>
-        </w:rPr>
-        <w:t>DVMRP:</w:t>
-      </w:r>
-      <w:r>
-        <w:t xml:space="preserve"> Distance Vector Multicast Routing Protocol using </w:t>
-      </w:r>
-      <w:r>
-        <w:rPr>
-          <w:b/>
-          <w:bCs/>
-        </w:rPr>
-        <w:t>Reverse Path Forwarding (RPF)</w:t>
-      </w:r>
-      <w:r>
-        <w:t xml:space="preserve"> combined with a </w:t>
-      </w:r>
-      <w:r>
-        <w:rPr>
-          <w:b/>
-          <w:bCs/>
-        </w:rPr>
-        <w:t>Prune and Graft</w:t>
-      </w:r>
-      <w:r>
-        <w:t xml:space="preserve"> mechanism to flood and prune distribution trees dynamically.</w:t>
-      </w:r>
-    </w:p>
-    <w:p>
-      <w:pPr>
-        <w:numPr>
-          <w:ilvl w:val="0"/>
-          <w:numId w:val="4"/>
-        </w:numPr>
-      </w:pPr>
-      <w:r>
-        <w:rPr>
-          <w:b/>
-          <w:bCs/>
-        </w:rPr>
-        <w:lastRenderedPageBreak/>
-        <w:t>MOSPF:</w:t>
-      </w:r>
-      <w:r>
-        <w:t xml:space="preserve"> Extends OSPF by embedding multicast group information directly into Link-State Advertisements to compute dynamic source-rooted shortest-path trees.</w:t>
-      </w:r>
-    </w:p>
-    <w:p>
-      <w:pPr>
-        <w:rPr>
-          <w:b/>
-          <w:bCs/>
-        </w:rPr>
-      </w:pPr>
-      <w:r>
-        <w:rPr>
-          <w:b/>
-          <w:bCs/>
-        </w:rPr>
-        <w:t>5. Software-Defined Routing (SDR/SDN)</w:t>
-      </w:r>
-    </w:p>
-    <w:p>
-      <w:pPr>
-        <w:numPr>
-          <w:ilvl w:val="0"/>
-          <w:numId w:val="5"/>
-        </w:numPr>
-      </w:pPr>
-      <w:r>
-        <w:rPr>
-          <w:b/>
-          <w:bCs/>
-        </w:rPr>
-        <w:t>Plane Separation:</w:t>
-      </w:r>
-      <w:r>
-        <w:t xml:space="preserve"> Decouples the centralized </w:t>
-      </w:r>
-      <w:r>
-        <w:rPr>
-          <w:b/>
-          <w:bCs/>
-        </w:rPr>
-        <w:t>Control Plane</w:t>
-      </w:r>
-      <w:r>
-        <w:t xml:space="preserve"> (routing decision logic) from the distributed </w:t>
-      </w:r>
-      <w:r>
-        <w:rPr>
-          <w:b/>
-          <w:bCs/>
-        </w:rPr>
-        <w:t>Data Plane</w:t>
-      </w:r>
-      <w:r>
-        <w:t xml:space="preserve"> (packet forwarding hardware).</w:t>
-      </w:r>
-    </w:p>
-    <w:p>
-      <w:pPr>
-        <w:numPr>
-          <w:ilvl w:val="0"/>
-          <w:numId w:val="5"/>
-        </w:numPr>
-      </w:pPr>
-      <w:r>
-        <w:rPr>
-          <w:b/>
-          <w:bCs/>
-        </w:rPr>
-        <w:t>Centralized Routing Control:</w:t>
-      </w:r>
-      <w:r>
-        <w:t xml:space="preserve"> A central software controller programmatically installs forwarding entries into flow tables via standard interfaces (like OpenFlow), enabling flexible, dynamic traffic engineering across the network.</w:t>
-      </w:r>
-    </w:p>
-    <w:p>
-      <w:hyperlink r:id="rId6" w:tgtFrame="_blank" w:history="1">
-        <w:r>
-          <w:rPr>
-            <w:rStyle w:val="Hyperlink"/>
-          </w:rPr>
-          <w:t>Distance Vector Routing - Bellman Ford Algorithm Tutorial</w:t>
-        </w:r>
-      </w:hyperlink>
-    </w:p>
-    <w:p>
-      <w:r>
-        <w:t>This video provides a practical explanation and numerical walk-through of the Bellman-Ford algorithm and table update mechanics, which are frequently asked on exams.</w:t>
+        <w:t>PSNP (Partial Sequence Number PDU):</w:t>
+      </w:r>
+      <w:r>
+        <w:t xml:space="preserve"> Equivalent to OSPF's LSR and </w:t>
+      </w:r>
+      <w:proofErr w:type="spellStart"/>
+      <w:r>
+        <w:t>LSAck</w:t>
+      </w:r>
+      <w:proofErr w:type="spellEnd"/>
+      <w:r>
+        <w:t>; requests missing LSPs or acknowledges received LSPs.</w:t>
       </w:r>
     </w:p>
     <w:p/>
@@ -2127,6 +1424,304 @@
     </w:lvl>
   </w:abstractNum>
   <w:abstractNum w:abstractNumId="2" w15:restartNumberingAfterBreak="0">
+    <w:nsid w:val="12F91146"/>
+    <w:multiLevelType w:val="multilevel"/>
+    <w:tmpl w:val="A4D40496"/>
+    <w:lvl w:ilvl="0">
+      <w:start w:val="1"/>
+      <w:numFmt w:val="bullet"/>
+      <w:lvlText w:val=""/>
+      <w:lvlJc w:val="left"/>
+      <w:pPr>
+        <w:tabs>
+          <w:tab w:val="num" w:pos="720"/>
+        </w:tabs>
+        <w:ind w:left="720" w:hanging="360"/>
+      </w:pPr>
+      <w:rPr>
+        <w:rFonts w:ascii="Symbol" w:hAnsi="Symbol" w:hint="default"/>
+        <w:sz w:val="20"/>
+      </w:rPr>
+    </w:lvl>
+    <w:lvl w:ilvl="1" w:tentative="1">
+      <w:start w:val="1"/>
+      <w:numFmt w:val="bullet"/>
+      <w:lvlText w:val="o"/>
+      <w:lvlJc w:val="left"/>
+      <w:pPr>
+        <w:tabs>
+          <w:tab w:val="num" w:pos="1440"/>
+        </w:tabs>
+        <w:ind w:left="1440" w:hanging="360"/>
+      </w:pPr>
+      <w:rPr>
+        <w:rFonts w:ascii="Courier New" w:hAnsi="Courier New" w:hint="default"/>
+        <w:sz w:val="20"/>
+      </w:rPr>
+    </w:lvl>
+    <w:lvl w:ilvl="2" w:tentative="1">
+      <w:start w:val="1"/>
+      <w:numFmt w:val="bullet"/>
+      <w:lvlText w:val=""/>
+      <w:lvlJc w:val="left"/>
+      <w:pPr>
+        <w:tabs>
+          <w:tab w:val="num" w:pos="2160"/>
+        </w:tabs>
+        <w:ind w:left="2160" w:hanging="360"/>
+      </w:pPr>
+      <w:rPr>
+        <w:rFonts w:ascii="Wingdings" w:hAnsi="Wingdings" w:hint="default"/>
+        <w:sz w:val="20"/>
+      </w:rPr>
+    </w:lvl>
+    <w:lvl w:ilvl="3" w:tentative="1">
+      <w:start w:val="1"/>
+      <w:numFmt w:val="bullet"/>
+      <w:lvlText w:val=""/>
+      <w:lvlJc w:val="left"/>
+      <w:pPr>
+        <w:tabs>
+          <w:tab w:val="num" w:pos="2880"/>
+        </w:tabs>
+        <w:ind w:left="2880" w:hanging="360"/>
+      </w:pPr>
+      <w:rPr>
+        <w:rFonts w:ascii="Wingdings" w:hAnsi="Wingdings" w:hint="default"/>
+        <w:sz w:val="20"/>
+      </w:rPr>
+    </w:lvl>
+    <w:lvl w:ilvl="4" w:tentative="1">
+      <w:start w:val="1"/>
+      <w:numFmt w:val="bullet"/>
+      <w:lvlText w:val=""/>
+      <w:lvlJc w:val="left"/>
+      <w:pPr>
+        <w:tabs>
+          <w:tab w:val="num" w:pos="3600"/>
+        </w:tabs>
+        <w:ind w:left="3600" w:hanging="360"/>
+      </w:pPr>
+      <w:rPr>
+        <w:rFonts w:ascii="Wingdings" w:hAnsi="Wingdings" w:hint="default"/>
+        <w:sz w:val="20"/>
+      </w:rPr>
+    </w:lvl>
+    <w:lvl w:ilvl="5" w:tentative="1">
+      <w:start w:val="1"/>
+      <w:numFmt w:val="bullet"/>
+      <w:lvlText w:val=""/>
+      <w:lvlJc w:val="left"/>
+      <w:pPr>
+        <w:tabs>
+          <w:tab w:val="num" w:pos="4320"/>
+        </w:tabs>
+        <w:ind w:left="4320" w:hanging="360"/>
+      </w:pPr>
+      <w:rPr>
+        <w:rFonts w:ascii="Wingdings" w:hAnsi="Wingdings" w:hint="default"/>
+        <w:sz w:val="20"/>
+      </w:rPr>
+    </w:lvl>
+    <w:lvl w:ilvl="6" w:tentative="1">
+      <w:start w:val="1"/>
+      <w:numFmt w:val="bullet"/>
+      <w:lvlText w:val=""/>
+      <w:lvlJc w:val="left"/>
+      <w:pPr>
+        <w:tabs>
+          <w:tab w:val="num" w:pos="5040"/>
+        </w:tabs>
+        <w:ind w:left="5040" w:hanging="360"/>
+      </w:pPr>
+      <w:rPr>
+        <w:rFonts w:ascii="Wingdings" w:hAnsi="Wingdings" w:hint="default"/>
+        <w:sz w:val="20"/>
+      </w:rPr>
+    </w:lvl>
+    <w:lvl w:ilvl="7" w:tentative="1">
+      <w:start w:val="1"/>
+      <w:numFmt w:val="bullet"/>
+      <w:lvlText w:val=""/>
+      <w:lvlJc w:val="left"/>
+      <w:pPr>
+        <w:tabs>
+          <w:tab w:val="num" w:pos="5760"/>
+        </w:tabs>
+        <w:ind w:left="5760" w:hanging="360"/>
+      </w:pPr>
+      <w:rPr>
+        <w:rFonts w:ascii="Wingdings" w:hAnsi="Wingdings" w:hint="default"/>
+        <w:sz w:val="20"/>
+      </w:rPr>
+    </w:lvl>
+    <w:lvl w:ilvl="8" w:tentative="1">
+      <w:start w:val="1"/>
+      <w:numFmt w:val="bullet"/>
+      <w:lvlText w:val=""/>
+      <w:lvlJc w:val="left"/>
+      <w:pPr>
+        <w:tabs>
+          <w:tab w:val="num" w:pos="6480"/>
+        </w:tabs>
+        <w:ind w:left="6480" w:hanging="360"/>
+      </w:pPr>
+      <w:rPr>
+        <w:rFonts w:ascii="Wingdings" w:hAnsi="Wingdings" w:hint="default"/>
+        <w:sz w:val="20"/>
+      </w:rPr>
+    </w:lvl>
+  </w:abstractNum>
+  <w:abstractNum w:abstractNumId="3" w15:restartNumberingAfterBreak="0">
+    <w:nsid w:val="1D9F0602"/>
+    <w:multiLevelType w:val="multilevel"/>
+    <w:tmpl w:val="4372C3C2"/>
+    <w:lvl w:ilvl="0">
+      <w:start w:val="1"/>
+      <w:numFmt w:val="bullet"/>
+      <w:lvlText w:val=""/>
+      <w:lvlJc w:val="left"/>
+      <w:pPr>
+        <w:tabs>
+          <w:tab w:val="num" w:pos="720"/>
+        </w:tabs>
+        <w:ind w:left="720" w:hanging="360"/>
+      </w:pPr>
+      <w:rPr>
+        <w:rFonts w:ascii="Symbol" w:hAnsi="Symbol" w:hint="default"/>
+        <w:sz w:val="20"/>
+      </w:rPr>
+    </w:lvl>
+    <w:lvl w:ilvl="1" w:tentative="1">
+      <w:start w:val="1"/>
+      <w:numFmt w:val="bullet"/>
+      <w:lvlText w:val="o"/>
+      <w:lvlJc w:val="left"/>
+      <w:pPr>
+        <w:tabs>
+          <w:tab w:val="num" w:pos="1440"/>
+        </w:tabs>
+        <w:ind w:left="1440" w:hanging="360"/>
+      </w:pPr>
+      <w:rPr>
+        <w:rFonts w:ascii="Courier New" w:hAnsi="Courier New" w:hint="default"/>
+        <w:sz w:val="20"/>
+      </w:rPr>
+    </w:lvl>
+    <w:lvl w:ilvl="2" w:tentative="1">
+      <w:start w:val="1"/>
+      <w:numFmt w:val="bullet"/>
+      <w:lvlText w:val=""/>
+      <w:lvlJc w:val="left"/>
+      <w:pPr>
+        <w:tabs>
+          <w:tab w:val="num" w:pos="2160"/>
+        </w:tabs>
+        <w:ind w:left="2160" w:hanging="360"/>
+      </w:pPr>
+      <w:rPr>
+        <w:rFonts w:ascii="Wingdings" w:hAnsi="Wingdings" w:hint="default"/>
+        <w:sz w:val="20"/>
+      </w:rPr>
+    </w:lvl>
+    <w:lvl w:ilvl="3" w:tentative="1">
+      <w:start w:val="1"/>
+      <w:numFmt w:val="bullet"/>
+      <w:lvlText w:val=""/>
+      <w:lvlJc w:val="left"/>
+      <w:pPr>
+        <w:tabs>
+          <w:tab w:val="num" w:pos="2880"/>
+        </w:tabs>
+        <w:ind w:left="2880" w:hanging="360"/>
+      </w:pPr>
+      <w:rPr>
+        <w:rFonts w:ascii="Wingdings" w:hAnsi="Wingdings" w:hint="default"/>
+        <w:sz w:val="20"/>
+      </w:rPr>
+    </w:lvl>
+    <w:lvl w:ilvl="4" w:tentative="1">
+      <w:start w:val="1"/>
+      <w:numFmt w:val="bullet"/>
+      <w:lvlText w:val=""/>
+      <w:lvlJc w:val="left"/>
+      <w:pPr>
+        <w:tabs>
+          <w:tab w:val="num" w:pos="3600"/>
+        </w:tabs>
+        <w:ind w:left="3600" w:hanging="360"/>
+      </w:pPr>
+      <w:rPr>
+        <w:rFonts w:ascii="Wingdings" w:hAnsi="Wingdings" w:hint="default"/>
+        <w:sz w:val="20"/>
+      </w:rPr>
+    </w:lvl>
+    <w:lvl w:ilvl="5" w:tentative="1">
+      <w:start w:val="1"/>
+      <w:numFmt w:val="bullet"/>
+      <w:lvlText w:val=""/>
+      <w:lvlJc w:val="left"/>
+      <w:pPr>
+        <w:tabs>
+          <w:tab w:val="num" w:pos="4320"/>
+        </w:tabs>
+        <w:ind w:left="4320" w:hanging="360"/>
+      </w:pPr>
+      <w:rPr>
+        <w:rFonts w:ascii="Wingdings" w:hAnsi="Wingdings" w:hint="default"/>
+        <w:sz w:val="20"/>
+      </w:rPr>
+    </w:lvl>
+    <w:lvl w:ilvl="6" w:tentative="1">
+      <w:start w:val="1"/>
+      <w:numFmt w:val="bullet"/>
+      <w:lvlText w:val=""/>
+      <w:lvlJc w:val="left"/>
+      <w:pPr>
+        <w:tabs>
+          <w:tab w:val="num" w:pos="5040"/>
+        </w:tabs>
+        <w:ind w:left="5040" w:hanging="360"/>
+      </w:pPr>
+      <w:rPr>
+        <w:rFonts w:ascii="Wingdings" w:hAnsi="Wingdings" w:hint="default"/>
+        <w:sz w:val="20"/>
+      </w:rPr>
+    </w:lvl>
+    <w:lvl w:ilvl="7" w:tentative="1">
+      <w:start w:val="1"/>
+      <w:numFmt w:val="bullet"/>
+      <w:lvlText w:val=""/>
+      <w:lvlJc w:val="left"/>
+      <w:pPr>
+        <w:tabs>
+          <w:tab w:val="num" w:pos="5760"/>
+        </w:tabs>
+        <w:ind w:left="5760" w:hanging="360"/>
+      </w:pPr>
+      <w:rPr>
+        <w:rFonts w:ascii="Wingdings" w:hAnsi="Wingdings" w:hint="default"/>
+        <w:sz w:val="20"/>
+      </w:rPr>
+    </w:lvl>
+    <w:lvl w:ilvl="8" w:tentative="1">
+      <w:start w:val="1"/>
+      <w:numFmt w:val="bullet"/>
+      <w:lvlText w:val=""/>
+      <w:lvlJc w:val="left"/>
+      <w:pPr>
+        <w:tabs>
+          <w:tab w:val="num" w:pos="6480"/>
+        </w:tabs>
+        <w:ind w:left="6480" w:hanging="360"/>
+      </w:pPr>
+      <w:rPr>
+        <w:rFonts w:ascii="Wingdings" w:hAnsi="Wingdings" w:hint="default"/>
+        <w:sz w:val="20"/>
+      </w:rPr>
+    </w:lvl>
+  </w:abstractNum>
+  <w:abstractNum w:abstractNumId="4" w15:restartNumberingAfterBreak="0">
     <w:nsid w:val="2DF67318"/>
     <w:multiLevelType w:val="multilevel"/>
     <w:tmpl w:val="792C33F0"/>
@@ -2275,7 +1870,7 @@
       </w:rPr>
     </w:lvl>
   </w:abstractNum>
-  <w:abstractNum w:abstractNumId="3" w15:restartNumberingAfterBreak="0">
+  <w:abstractNum w:abstractNumId="5" w15:restartNumberingAfterBreak="0">
     <w:nsid w:val="363C5F7B"/>
     <w:multiLevelType w:val="multilevel"/>
     <w:tmpl w:val="5CE64CE0"/>
@@ -2420,7 +2015,603 @@
       </w:rPr>
     </w:lvl>
   </w:abstractNum>
-  <w:abstractNum w:abstractNumId="4" w15:restartNumberingAfterBreak="0">
+  <w:abstractNum w:abstractNumId="6" w15:restartNumberingAfterBreak="0">
+    <w:nsid w:val="3E503794"/>
+    <w:multiLevelType w:val="multilevel"/>
+    <w:tmpl w:val="ECA2A85C"/>
+    <w:lvl w:ilvl="0">
+      <w:start w:val="1"/>
+      <w:numFmt w:val="bullet"/>
+      <w:lvlText w:val=""/>
+      <w:lvlJc w:val="left"/>
+      <w:pPr>
+        <w:tabs>
+          <w:tab w:val="num" w:pos="720"/>
+        </w:tabs>
+        <w:ind w:left="720" w:hanging="360"/>
+      </w:pPr>
+      <w:rPr>
+        <w:rFonts w:ascii="Symbol" w:hAnsi="Symbol" w:hint="default"/>
+        <w:sz w:val="20"/>
+      </w:rPr>
+    </w:lvl>
+    <w:lvl w:ilvl="1" w:tentative="1">
+      <w:start w:val="1"/>
+      <w:numFmt w:val="bullet"/>
+      <w:lvlText w:val="o"/>
+      <w:lvlJc w:val="left"/>
+      <w:pPr>
+        <w:tabs>
+          <w:tab w:val="num" w:pos="1440"/>
+        </w:tabs>
+        <w:ind w:left="1440" w:hanging="360"/>
+      </w:pPr>
+      <w:rPr>
+        <w:rFonts w:ascii="Courier New" w:hAnsi="Courier New" w:hint="default"/>
+        <w:sz w:val="20"/>
+      </w:rPr>
+    </w:lvl>
+    <w:lvl w:ilvl="2" w:tentative="1">
+      <w:start w:val="1"/>
+      <w:numFmt w:val="bullet"/>
+      <w:lvlText w:val=""/>
+      <w:lvlJc w:val="left"/>
+      <w:pPr>
+        <w:tabs>
+          <w:tab w:val="num" w:pos="2160"/>
+        </w:tabs>
+        <w:ind w:left="2160" w:hanging="360"/>
+      </w:pPr>
+      <w:rPr>
+        <w:rFonts w:ascii="Wingdings" w:hAnsi="Wingdings" w:hint="default"/>
+        <w:sz w:val="20"/>
+      </w:rPr>
+    </w:lvl>
+    <w:lvl w:ilvl="3" w:tentative="1">
+      <w:start w:val="1"/>
+      <w:numFmt w:val="bullet"/>
+      <w:lvlText w:val=""/>
+      <w:lvlJc w:val="left"/>
+      <w:pPr>
+        <w:tabs>
+          <w:tab w:val="num" w:pos="2880"/>
+        </w:tabs>
+        <w:ind w:left="2880" w:hanging="360"/>
+      </w:pPr>
+      <w:rPr>
+        <w:rFonts w:ascii="Wingdings" w:hAnsi="Wingdings" w:hint="default"/>
+        <w:sz w:val="20"/>
+      </w:rPr>
+    </w:lvl>
+    <w:lvl w:ilvl="4" w:tentative="1">
+      <w:start w:val="1"/>
+      <w:numFmt w:val="bullet"/>
+      <w:lvlText w:val=""/>
+      <w:lvlJc w:val="left"/>
+      <w:pPr>
+        <w:tabs>
+          <w:tab w:val="num" w:pos="3600"/>
+        </w:tabs>
+        <w:ind w:left="3600" w:hanging="360"/>
+      </w:pPr>
+      <w:rPr>
+        <w:rFonts w:ascii="Wingdings" w:hAnsi="Wingdings" w:hint="default"/>
+        <w:sz w:val="20"/>
+      </w:rPr>
+    </w:lvl>
+    <w:lvl w:ilvl="5" w:tentative="1">
+      <w:start w:val="1"/>
+      <w:numFmt w:val="bullet"/>
+      <w:lvlText w:val=""/>
+      <w:lvlJc w:val="left"/>
+      <w:pPr>
+        <w:tabs>
+          <w:tab w:val="num" w:pos="4320"/>
+        </w:tabs>
+        <w:ind w:left="4320" w:hanging="360"/>
+      </w:pPr>
+      <w:rPr>
+        <w:rFonts w:ascii="Wingdings" w:hAnsi="Wingdings" w:hint="default"/>
+        <w:sz w:val="20"/>
+      </w:rPr>
+    </w:lvl>
+    <w:lvl w:ilvl="6" w:tentative="1">
+      <w:start w:val="1"/>
+      <w:numFmt w:val="bullet"/>
+      <w:lvlText w:val=""/>
+      <w:lvlJc w:val="left"/>
+      <w:pPr>
+        <w:tabs>
+          <w:tab w:val="num" w:pos="5040"/>
+        </w:tabs>
+        <w:ind w:left="5040" w:hanging="360"/>
+      </w:pPr>
+      <w:rPr>
+        <w:rFonts w:ascii="Wingdings" w:hAnsi="Wingdings" w:hint="default"/>
+        <w:sz w:val="20"/>
+      </w:rPr>
+    </w:lvl>
+    <w:lvl w:ilvl="7" w:tentative="1">
+      <w:start w:val="1"/>
+      <w:numFmt w:val="bullet"/>
+      <w:lvlText w:val=""/>
+      <w:lvlJc w:val="left"/>
+      <w:pPr>
+        <w:tabs>
+          <w:tab w:val="num" w:pos="5760"/>
+        </w:tabs>
+        <w:ind w:left="5760" w:hanging="360"/>
+      </w:pPr>
+      <w:rPr>
+        <w:rFonts w:ascii="Wingdings" w:hAnsi="Wingdings" w:hint="default"/>
+        <w:sz w:val="20"/>
+      </w:rPr>
+    </w:lvl>
+    <w:lvl w:ilvl="8" w:tentative="1">
+      <w:start w:val="1"/>
+      <w:numFmt w:val="bullet"/>
+      <w:lvlText w:val=""/>
+      <w:lvlJc w:val="left"/>
+      <w:pPr>
+        <w:tabs>
+          <w:tab w:val="num" w:pos="6480"/>
+        </w:tabs>
+        <w:ind w:left="6480" w:hanging="360"/>
+      </w:pPr>
+      <w:rPr>
+        <w:rFonts w:ascii="Wingdings" w:hAnsi="Wingdings" w:hint="default"/>
+        <w:sz w:val="20"/>
+      </w:rPr>
+    </w:lvl>
+  </w:abstractNum>
+  <w:abstractNum w:abstractNumId="7" w15:restartNumberingAfterBreak="0">
+    <w:nsid w:val="432B7AAD"/>
+    <w:multiLevelType w:val="multilevel"/>
+    <w:tmpl w:val="0A48B7CE"/>
+    <w:lvl w:ilvl="0">
+      <w:start w:val="1"/>
+      <w:numFmt w:val="bullet"/>
+      <w:lvlText w:val=""/>
+      <w:lvlJc w:val="left"/>
+      <w:pPr>
+        <w:tabs>
+          <w:tab w:val="num" w:pos="720"/>
+        </w:tabs>
+        <w:ind w:left="720" w:hanging="360"/>
+      </w:pPr>
+      <w:rPr>
+        <w:rFonts w:ascii="Symbol" w:hAnsi="Symbol" w:hint="default"/>
+        <w:sz w:val="20"/>
+      </w:rPr>
+    </w:lvl>
+    <w:lvl w:ilvl="1" w:tentative="1">
+      <w:start w:val="1"/>
+      <w:numFmt w:val="bullet"/>
+      <w:lvlText w:val="o"/>
+      <w:lvlJc w:val="left"/>
+      <w:pPr>
+        <w:tabs>
+          <w:tab w:val="num" w:pos="1440"/>
+        </w:tabs>
+        <w:ind w:left="1440" w:hanging="360"/>
+      </w:pPr>
+      <w:rPr>
+        <w:rFonts w:ascii="Courier New" w:hAnsi="Courier New" w:hint="default"/>
+        <w:sz w:val="20"/>
+      </w:rPr>
+    </w:lvl>
+    <w:lvl w:ilvl="2" w:tentative="1">
+      <w:start w:val="1"/>
+      <w:numFmt w:val="bullet"/>
+      <w:lvlText w:val=""/>
+      <w:lvlJc w:val="left"/>
+      <w:pPr>
+        <w:tabs>
+          <w:tab w:val="num" w:pos="2160"/>
+        </w:tabs>
+        <w:ind w:left="2160" w:hanging="360"/>
+      </w:pPr>
+      <w:rPr>
+        <w:rFonts w:ascii="Wingdings" w:hAnsi="Wingdings" w:hint="default"/>
+        <w:sz w:val="20"/>
+      </w:rPr>
+    </w:lvl>
+    <w:lvl w:ilvl="3" w:tentative="1">
+      <w:start w:val="1"/>
+      <w:numFmt w:val="bullet"/>
+      <w:lvlText w:val=""/>
+      <w:lvlJc w:val="left"/>
+      <w:pPr>
+        <w:tabs>
+          <w:tab w:val="num" w:pos="2880"/>
+        </w:tabs>
+        <w:ind w:left="2880" w:hanging="360"/>
+      </w:pPr>
+      <w:rPr>
+        <w:rFonts w:ascii="Wingdings" w:hAnsi="Wingdings" w:hint="default"/>
+        <w:sz w:val="20"/>
+      </w:rPr>
+    </w:lvl>
+    <w:lvl w:ilvl="4" w:tentative="1">
+      <w:start w:val="1"/>
+      <w:numFmt w:val="bullet"/>
+      <w:lvlText w:val=""/>
+      <w:lvlJc w:val="left"/>
+      <w:pPr>
+        <w:tabs>
+          <w:tab w:val="num" w:pos="3600"/>
+        </w:tabs>
+        <w:ind w:left="3600" w:hanging="360"/>
+      </w:pPr>
+      <w:rPr>
+        <w:rFonts w:ascii="Wingdings" w:hAnsi="Wingdings" w:hint="default"/>
+        <w:sz w:val="20"/>
+      </w:rPr>
+    </w:lvl>
+    <w:lvl w:ilvl="5" w:tentative="1">
+      <w:start w:val="1"/>
+      <w:numFmt w:val="bullet"/>
+      <w:lvlText w:val=""/>
+      <w:lvlJc w:val="left"/>
+      <w:pPr>
+        <w:tabs>
+          <w:tab w:val="num" w:pos="4320"/>
+        </w:tabs>
+        <w:ind w:left="4320" w:hanging="360"/>
+      </w:pPr>
+      <w:rPr>
+        <w:rFonts w:ascii="Wingdings" w:hAnsi="Wingdings" w:hint="default"/>
+        <w:sz w:val="20"/>
+      </w:rPr>
+    </w:lvl>
+    <w:lvl w:ilvl="6" w:tentative="1">
+      <w:start w:val="1"/>
+      <w:numFmt w:val="bullet"/>
+      <w:lvlText w:val=""/>
+      <w:lvlJc w:val="left"/>
+      <w:pPr>
+        <w:tabs>
+          <w:tab w:val="num" w:pos="5040"/>
+        </w:tabs>
+        <w:ind w:left="5040" w:hanging="360"/>
+      </w:pPr>
+      <w:rPr>
+        <w:rFonts w:ascii="Wingdings" w:hAnsi="Wingdings" w:hint="default"/>
+        <w:sz w:val="20"/>
+      </w:rPr>
+    </w:lvl>
+    <w:lvl w:ilvl="7" w:tentative="1">
+      <w:start w:val="1"/>
+      <w:numFmt w:val="bullet"/>
+      <w:lvlText w:val=""/>
+      <w:lvlJc w:val="left"/>
+      <w:pPr>
+        <w:tabs>
+          <w:tab w:val="num" w:pos="5760"/>
+        </w:tabs>
+        <w:ind w:left="5760" w:hanging="360"/>
+      </w:pPr>
+      <w:rPr>
+        <w:rFonts w:ascii="Wingdings" w:hAnsi="Wingdings" w:hint="default"/>
+        <w:sz w:val="20"/>
+      </w:rPr>
+    </w:lvl>
+    <w:lvl w:ilvl="8" w:tentative="1">
+      <w:start w:val="1"/>
+      <w:numFmt w:val="bullet"/>
+      <w:lvlText w:val=""/>
+      <w:lvlJc w:val="left"/>
+      <w:pPr>
+        <w:tabs>
+          <w:tab w:val="num" w:pos="6480"/>
+        </w:tabs>
+        <w:ind w:left="6480" w:hanging="360"/>
+      </w:pPr>
+      <w:rPr>
+        <w:rFonts w:ascii="Wingdings" w:hAnsi="Wingdings" w:hint="default"/>
+        <w:sz w:val="20"/>
+      </w:rPr>
+    </w:lvl>
+  </w:abstractNum>
+  <w:abstractNum w:abstractNumId="8" w15:restartNumberingAfterBreak="0">
+    <w:nsid w:val="4C7453BB"/>
+    <w:multiLevelType w:val="multilevel"/>
+    <w:tmpl w:val="F7D89D12"/>
+    <w:lvl w:ilvl="0">
+      <w:start w:val="1"/>
+      <w:numFmt w:val="bullet"/>
+      <w:lvlText w:val=""/>
+      <w:lvlJc w:val="left"/>
+      <w:pPr>
+        <w:tabs>
+          <w:tab w:val="num" w:pos="720"/>
+        </w:tabs>
+        <w:ind w:left="720" w:hanging="360"/>
+      </w:pPr>
+      <w:rPr>
+        <w:rFonts w:ascii="Symbol" w:hAnsi="Symbol" w:hint="default"/>
+        <w:sz w:val="20"/>
+      </w:rPr>
+    </w:lvl>
+    <w:lvl w:ilvl="1" w:tentative="1">
+      <w:start w:val="1"/>
+      <w:numFmt w:val="bullet"/>
+      <w:lvlText w:val="o"/>
+      <w:lvlJc w:val="left"/>
+      <w:pPr>
+        <w:tabs>
+          <w:tab w:val="num" w:pos="1440"/>
+        </w:tabs>
+        <w:ind w:left="1440" w:hanging="360"/>
+      </w:pPr>
+      <w:rPr>
+        <w:rFonts w:ascii="Courier New" w:hAnsi="Courier New" w:hint="default"/>
+        <w:sz w:val="20"/>
+      </w:rPr>
+    </w:lvl>
+    <w:lvl w:ilvl="2" w:tentative="1">
+      <w:start w:val="1"/>
+      <w:numFmt w:val="bullet"/>
+      <w:lvlText w:val=""/>
+      <w:lvlJc w:val="left"/>
+      <w:pPr>
+        <w:tabs>
+          <w:tab w:val="num" w:pos="2160"/>
+        </w:tabs>
+        <w:ind w:left="2160" w:hanging="360"/>
+      </w:pPr>
+      <w:rPr>
+        <w:rFonts w:ascii="Wingdings" w:hAnsi="Wingdings" w:hint="default"/>
+        <w:sz w:val="20"/>
+      </w:rPr>
+    </w:lvl>
+    <w:lvl w:ilvl="3" w:tentative="1">
+      <w:start w:val="1"/>
+      <w:numFmt w:val="bullet"/>
+      <w:lvlText w:val=""/>
+      <w:lvlJc w:val="left"/>
+      <w:pPr>
+        <w:tabs>
+          <w:tab w:val="num" w:pos="2880"/>
+        </w:tabs>
+        <w:ind w:left="2880" w:hanging="360"/>
+      </w:pPr>
+      <w:rPr>
+        <w:rFonts w:ascii="Wingdings" w:hAnsi="Wingdings" w:hint="default"/>
+        <w:sz w:val="20"/>
+      </w:rPr>
+    </w:lvl>
+    <w:lvl w:ilvl="4" w:tentative="1">
+      <w:start w:val="1"/>
+      <w:numFmt w:val="bullet"/>
+      <w:lvlText w:val=""/>
+      <w:lvlJc w:val="left"/>
+      <w:pPr>
+        <w:tabs>
+          <w:tab w:val="num" w:pos="3600"/>
+        </w:tabs>
+        <w:ind w:left="3600" w:hanging="360"/>
+      </w:pPr>
+      <w:rPr>
+        <w:rFonts w:ascii="Wingdings" w:hAnsi="Wingdings" w:hint="default"/>
+        <w:sz w:val="20"/>
+      </w:rPr>
+    </w:lvl>
+    <w:lvl w:ilvl="5" w:tentative="1">
+      <w:start w:val="1"/>
+      <w:numFmt w:val="bullet"/>
+      <w:lvlText w:val=""/>
+      <w:lvlJc w:val="left"/>
+      <w:pPr>
+        <w:tabs>
+          <w:tab w:val="num" w:pos="4320"/>
+        </w:tabs>
+        <w:ind w:left="4320" w:hanging="360"/>
+      </w:pPr>
+      <w:rPr>
+        <w:rFonts w:ascii="Wingdings" w:hAnsi="Wingdings" w:hint="default"/>
+        <w:sz w:val="20"/>
+      </w:rPr>
+    </w:lvl>
+    <w:lvl w:ilvl="6" w:tentative="1">
+      <w:start w:val="1"/>
+      <w:numFmt w:val="bullet"/>
+      <w:lvlText w:val=""/>
+      <w:lvlJc w:val="left"/>
+      <w:pPr>
+        <w:tabs>
+          <w:tab w:val="num" w:pos="5040"/>
+        </w:tabs>
+        <w:ind w:left="5040" w:hanging="360"/>
+      </w:pPr>
+      <w:rPr>
+        <w:rFonts w:ascii="Wingdings" w:hAnsi="Wingdings" w:hint="default"/>
+        <w:sz w:val="20"/>
+      </w:rPr>
+    </w:lvl>
+    <w:lvl w:ilvl="7" w:tentative="1">
+      <w:start w:val="1"/>
+      <w:numFmt w:val="bullet"/>
+      <w:lvlText w:val=""/>
+      <w:lvlJc w:val="left"/>
+      <w:pPr>
+        <w:tabs>
+          <w:tab w:val="num" w:pos="5760"/>
+        </w:tabs>
+        <w:ind w:left="5760" w:hanging="360"/>
+      </w:pPr>
+      <w:rPr>
+        <w:rFonts w:ascii="Wingdings" w:hAnsi="Wingdings" w:hint="default"/>
+        <w:sz w:val="20"/>
+      </w:rPr>
+    </w:lvl>
+    <w:lvl w:ilvl="8" w:tentative="1">
+      <w:start w:val="1"/>
+      <w:numFmt w:val="bullet"/>
+      <w:lvlText w:val=""/>
+      <w:lvlJc w:val="left"/>
+      <w:pPr>
+        <w:tabs>
+          <w:tab w:val="num" w:pos="6480"/>
+        </w:tabs>
+        <w:ind w:left="6480" w:hanging="360"/>
+      </w:pPr>
+      <w:rPr>
+        <w:rFonts w:ascii="Wingdings" w:hAnsi="Wingdings" w:hint="default"/>
+        <w:sz w:val="20"/>
+      </w:rPr>
+    </w:lvl>
+  </w:abstractNum>
+  <w:abstractNum w:abstractNumId="9" w15:restartNumberingAfterBreak="0">
+    <w:nsid w:val="51D638E3"/>
+    <w:multiLevelType w:val="multilevel"/>
+    <w:tmpl w:val="295884DC"/>
+    <w:lvl w:ilvl="0">
+      <w:start w:val="1"/>
+      <w:numFmt w:val="bullet"/>
+      <w:lvlText w:val=""/>
+      <w:lvlJc w:val="left"/>
+      <w:pPr>
+        <w:tabs>
+          <w:tab w:val="num" w:pos="720"/>
+        </w:tabs>
+        <w:ind w:left="720" w:hanging="360"/>
+      </w:pPr>
+      <w:rPr>
+        <w:rFonts w:ascii="Symbol" w:hAnsi="Symbol" w:hint="default"/>
+        <w:sz w:val="20"/>
+      </w:rPr>
+    </w:lvl>
+    <w:lvl w:ilvl="1" w:tentative="1">
+      <w:start w:val="1"/>
+      <w:numFmt w:val="bullet"/>
+      <w:lvlText w:val="o"/>
+      <w:lvlJc w:val="left"/>
+      <w:pPr>
+        <w:tabs>
+          <w:tab w:val="num" w:pos="1440"/>
+        </w:tabs>
+        <w:ind w:left="1440" w:hanging="360"/>
+      </w:pPr>
+      <w:rPr>
+        <w:rFonts w:ascii="Courier New" w:hAnsi="Courier New" w:hint="default"/>
+        <w:sz w:val="20"/>
+      </w:rPr>
+    </w:lvl>
+    <w:lvl w:ilvl="2" w:tentative="1">
+      <w:start w:val="1"/>
+      <w:numFmt w:val="bullet"/>
+      <w:lvlText w:val=""/>
+      <w:lvlJc w:val="left"/>
+      <w:pPr>
+        <w:tabs>
+          <w:tab w:val="num" w:pos="2160"/>
+        </w:tabs>
+        <w:ind w:left="2160" w:hanging="360"/>
+      </w:pPr>
+      <w:rPr>
+        <w:rFonts w:ascii="Wingdings" w:hAnsi="Wingdings" w:hint="default"/>
+        <w:sz w:val="20"/>
+      </w:rPr>
+    </w:lvl>
+    <w:lvl w:ilvl="3" w:tentative="1">
+      <w:start w:val="1"/>
+      <w:numFmt w:val="bullet"/>
+      <w:lvlText w:val=""/>
+      <w:lvlJc w:val="left"/>
+      <w:pPr>
+        <w:tabs>
+          <w:tab w:val="num" w:pos="2880"/>
+        </w:tabs>
+        <w:ind w:left="2880" w:hanging="360"/>
+      </w:pPr>
+      <w:rPr>
+        <w:rFonts w:ascii="Wingdings" w:hAnsi="Wingdings" w:hint="default"/>
+        <w:sz w:val="20"/>
+      </w:rPr>
+    </w:lvl>
+    <w:lvl w:ilvl="4" w:tentative="1">
+      <w:start w:val="1"/>
+      <w:numFmt w:val="bullet"/>
+      <w:lvlText w:val=""/>
+      <w:lvlJc w:val="left"/>
+      <w:pPr>
+        <w:tabs>
+          <w:tab w:val="num" w:pos="3600"/>
+        </w:tabs>
+        <w:ind w:left="3600" w:hanging="360"/>
+      </w:pPr>
+      <w:rPr>
+        <w:rFonts w:ascii="Wingdings" w:hAnsi="Wingdings" w:hint="default"/>
+        <w:sz w:val="20"/>
+      </w:rPr>
+    </w:lvl>
+    <w:lvl w:ilvl="5" w:tentative="1">
+      <w:start w:val="1"/>
+      <w:numFmt w:val="bullet"/>
+      <w:lvlText w:val=""/>
+      <w:lvlJc w:val="left"/>
+      <w:pPr>
+        <w:tabs>
+          <w:tab w:val="num" w:pos="4320"/>
+        </w:tabs>
+        <w:ind w:left="4320" w:hanging="360"/>
+      </w:pPr>
+      <w:rPr>
+        <w:rFonts w:ascii="Wingdings" w:hAnsi="Wingdings" w:hint="default"/>
+        <w:sz w:val="20"/>
+      </w:rPr>
+    </w:lvl>
+    <w:lvl w:ilvl="6" w:tentative="1">
+      <w:start w:val="1"/>
+      <w:numFmt w:val="bullet"/>
+      <w:lvlText w:val=""/>
+      <w:lvlJc w:val="left"/>
+      <w:pPr>
+        <w:tabs>
+          <w:tab w:val="num" w:pos="5040"/>
+        </w:tabs>
+        <w:ind w:left="5040" w:hanging="360"/>
+      </w:pPr>
+      <w:rPr>
+        <w:rFonts w:ascii="Wingdings" w:hAnsi="Wingdings" w:hint="default"/>
+        <w:sz w:val="20"/>
+      </w:rPr>
+    </w:lvl>
+    <w:lvl w:ilvl="7" w:tentative="1">
+      <w:start w:val="1"/>
+      <w:numFmt w:val="bullet"/>
+      <w:lvlText w:val=""/>
+      <w:lvlJc w:val="left"/>
+      <w:pPr>
+        <w:tabs>
+          <w:tab w:val="num" w:pos="5760"/>
+        </w:tabs>
+        <w:ind w:left="5760" w:hanging="360"/>
+      </w:pPr>
+      <w:rPr>
+        <w:rFonts w:ascii="Wingdings" w:hAnsi="Wingdings" w:hint="default"/>
+        <w:sz w:val="20"/>
+      </w:rPr>
+    </w:lvl>
+    <w:lvl w:ilvl="8" w:tentative="1">
+      <w:start w:val="1"/>
+      <w:numFmt w:val="bullet"/>
+      <w:lvlText w:val=""/>
+      <w:lvlJc w:val="left"/>
+      <w:pPr>
+        <w:tabs>
+          <w:tab w:val="num" w:pos="6480"/>
+        </w:tabs>
+        <w:ind w:left="6480" w:hanging="360"/>
+      </w:pPr>
+      <w:rPr>
+        <w:rFonts w:ascii="Wingdings" w:hAnsi="Wingdings" w:hint="default"/>
+        <w:sz w:val="20"/>
+      </w:rPr>
+    </w:lvl>
+  </w:abstractNum>
+  <w:abstractNum w:abstractNumId="10" w15:restartNumberingAfterBreak="0">
     <w:nsid w:val="66161B30"/>
     <w:multiLevelType w:val="multilevel"/>
     <w:tmpl w:val="486CED4E"/>
@@ -2570,19 +2761,37 @@
     </w:lvl>
   </w:abstractNum>
   <w:num w:numId="1" w16cid:durableId="1853059366">
-    <w:abstractNumId w:val="2"/>
+    <w:abstractNumId w:val="4"/>
   </w:num>
   <w:num w:numId="2" w16cid:durableId="724842281">
     <w:abstractNumId w:val="0"/>
   </w:num>
   <w:num w:numId="3" w16cid:durableId="1410426719">
-    <w:abstractNumId w:val="3"/>
+    <w:abstractNumId w:val="5"/>
   </w:num>
   <w:num w:numId="4" w16cid:durableId="1157696442">
-    <w:abstractNumId w:val="4"/>
+    <w:abstractNumId w:val="10"/>
   </w:num>
   <w:num w:numId="5" w16cid:durableId="1279487619">
     <w:abstractNumId w:val="1"/>
+  </w:num>
+  <w:num w:numId="6" w16cid:durableId="1841652854">
+    <w:abstractNumId w:val="7"/>
+  </w:num>
+  <w:num w:numId="7" w16cid:durableId="918518053">
+    <w:abstractNumId w:val="9"/>
+  </w:num>
+  <w:num w:numId="8" w16cid:durableId="626473856">
+    <w:abstractNumId w:val="8"/>
+  </w:num>
+  <w:num w:numId="9" w16cid:durableId="435563816">
+    <w:abstractNumId w:val="2"/>
+  </w:num>
+  <w:num w:numId="10" w16cid:durableId="1243877931">
+    <w:abstractNumId w:val="3"/>
+  </w:num>
+  <w:num w:numId="11" w16cid:durableId="989288831">
+    <w:abstractNumId w:val="6"/>
   </w:num>
 </w:numbering>
 </file>
@@ -3015,7 +3224,6 @@
     <w:next w:val="Normal"/>
     <w:link w:val="Heading2Char"/>
     <w:uiPriority w:val="9"/>
-    <w:semiHidden/>
     <w:unhideWhenUsed/>
     <w:qFormat/>
     <w:rsid w:val="00E41BB9"/>
@@ -3190,7 +3398,6 @@
   <w:style w:type="character" w:default="1" w:styleId="DefaultParagraphFont">
     <w:name w:val="Default Paragraph Font"/>
     <w:uiPriority w:val="1"/>
-    <w:semiHidden/>
     <w:unhideWhenUsed/>
   </w:style>
   <w:style w:type="table" w:default="1" w:styleId="TableNormal">
@@ -3232,7 +3439,6 @@
     <w:basedOn w:val="DefaultParagraphFont"/>
     <w:link w:val="Heading2"/>
     <w:uiPriority w:val="9"/>
-    <w:semiHidden/>
     <w:rsid w:val="00E41BB9"/>
     <w:rPr>
       <w:rFonts w:asciiTheme="majorHAnsi" w:eastAsiaTheme="majorEastAsia" w:hAnsiTheme="majorHAnsi" w:cstheme="majorBidi"/>

</xml_diff>

<commit_message>
acn path vector notes added
</commit_message>
<xml_diff>
--- a/ACN/theory/unit_2.docx
+++ b/ACN/theory/unit_2.docx
@@ -622,6 +622,883 @@
     </w:p>
     <w:p>
       <w:pPr>
+        <w:ind w:left="720"/>
+      </w:pPr>
+      <w:r>
+        <w:rPr>
+          <w:b/>
+          <w:bCs/>
+        </w:rPr>
+        <w:t>Core Components of an IGP</w:t>
+      </w:r>
+    </w:p>
+    <w:p>
+      <w:pPr>
+        <w:ind w:left="720"/>
+      </w:pPr>
+      <w:r>
+        <w:t>Every Interior Gateway Protocol (IGP) consists of four core operational components running inside the router:</w:t>
+      </w:r>
+    </w:p>
+    <w:p>
+      <w:pPr>
+        <w:numPr>
+          <w:ilvl w:val="0"/>
+          <w:numId w:val="17"/>
+        </w:numPr>
+      </w:pPr>
+      <w:r>
+        <w:rPr>
+          <w:b/>
+          <w:bCs/>
+        </w:rPr>
+        <w:t>Data Structures (Databases):</w:t>
+      </w:r>
+    </w:p>
+    <w:p>
+      <w:pPr>
+        <w:numPr>
+          <w:ilvl w:val="1"/>
+          <w:numId w:val="17"/>
+        </w:numPr>
+      </w:pPr>
+      <w:proofErr w:type="spellStart"/>
+      <w:r>
+        <w:rPr>
+          <w:i/>
+          <w:iCs/>
+        </w:rPr>
+        <w:t>Neighbor</w:t>
+      </w:r>
+      <w:proofErr w:type="spellEnd"/>
+      <w:r>
+        <w:rPr>
+          <w:i/>
+          <w:iCs/>
+        </w:rPr>
+        <w:t>/Adjacency Table:</w:t>
+      </w:r>
+      <w:r>
+        <w:t xml:space="preserve"> Tracks the status, IP addresses, and operational states of directly connected adjacent routers running the same protocol.</w:t>
+      </w:r>
+    </w:p>
+    <w:p>
+      <w:pPr>
+        <w:numPr>
+          <w:ilvl w:val="1"/>
+          <w:numId w:val="17"/>
+        </w:numPr>
+      </w:pPr>
+      <w:r>
+        <w:rPr>
+          <w:i/>
+          <w:iCs/>
+        </w:rPr>
+        <w:t>Topology Database:</w:t>
+      </w:r>
+      <w:r>
+        <w:t xml:space="preserve"> Stores raw network information (such as the Link-State Database / LSDB in OSPF/IS-IS) or full distance lists prior to path filtering.</w:t>
+      </w:r>
+    </w:p>
+    <w:p>
+      <w:pPr>
+        <w:numPr>
+          <w:ilvl w:val="1"/>
+          <w:numId w:val="17"/>
+        </w:numPr>
+      </w:pPr>
+      <w:r>
+        <w:rPr>
+          <w:i/>
+          <w:iCs/>
+        </w:rPr>
+        <w:t>Routing Table (Forwarding Table):</w:t>
+      </w:r>
+      <w:r>
+        <w:t xml:space="preserve"> Contains only the best, optimal paths chosen by the algorithm for active packet forwarding.</w:t>
+      </w:r>
+    </w:p>
+    <w:p>
+      <w:pPr>
+        <w:numPr>
+          <w:ilvl w:val="0"/>
+          <w:numId w:val="17"/>
+        </w:numPr>
+      </w:pPr>
+      <w:r>
+        <w:rPr>
+          <w:b/>
+          <w:bCs/>
+        </w:rPr>
+        <w:t>Protocol Messages &amp; Packet Engine:</w:t>
+      </w:r>
+    </w:p>
+    <w:p>
+      <w:pPr>
+        <w:numPr>
+          <w:ilvl w:val="1"/>
+          <w:numId w:val="17"/>
+        </w:numPr>
+      </w:pPr>
+      <w:r>
+        <w:t xml:space="preserve">Handles the creation, transmission, and parsing of control packets used for </w:t>
+      </w:r>
+      <w:proofErr w:type="spellStart"/>
+      <w:r>
+        <w:t>neighbor</w:t>
+      </w:r>
+      <w:proofErr w:type="spellEnd"/>
+      <w:r>
+        <w:t xml:space="preserve"> discovery, topology synchronization, route updates, and delivery acknowledgments.</w:t>
+      </w:r>
+    </w:p>
+    <w:p>
+      <w:pPr>
+        <w:numPr>
+          <w:ilvl w:val="0"/>
+          <w:numId w:val="17"/>
+        </w:numPr>
+      </w:pPr>
+      <w:r>
+        <w:rPr>
+          <w:b/>
+          <w:bCs/>
+        </w:rPr>
+        <w:t>Algorithmic Engine:</w:t>
+      </w:r>
+    </w:p>
+    <w:p>
+      <w:pPr>
+        <w:numPr>
+          <w:ilvl w:val="1"/>
+          <w:numId w:val="17"/>
+        </w:numPr>
+      </w:pPr>
+      <w:r>
+        <w:t>Executes pathfinding calculations over the topology database to compute loop-free shortest paths (e.g., Dijkstra's algorithm in Link-State protocols, Bellman-Ford in Distance-Vector protocols).</w:t>
+      </w:r>
+    </w:p>
+    <w:p>
+      <w:pPr>
+        <w:numPr>
+          <w:ilvl w:val="0"/>
+          <w:numId w:val="17"/>
+        </w:numPr>
+      </w:pPr>
+      <w:r>
+        <w:rPr>
+          <w:b/>
+          <w:bCs/>
+        </w:rPr>
+        <w:t>Timers &amp; State Machines:</w:t>
+      </w:r>
+    </w:p>
+    <w:p>
+      <w:pPr>
+        <w:numPr>
+          <w:ilvl w:val="1"/>
+          <w:numId w:val="17"/>
+        </w:numPr>
+      </w:pPr>
+      <w:r>
+        <w:t xml:space="preserve">Enforces state transitions (e.g., OSPF </w:t>
+      </w:r>
+      <w:proofErr w:type="spellStart"/>
+      <w:r>
+        <w:t>Neighbor</w:t>
+      </w:r>
+      <w:proofErr w:type="spellEnd"/>
+      <w:r>
+        <w:t xml:space="preserve"> States: </w:t>
+      </w:r>
+      <m:oMath>
+        <m:r>
+          <m:rPr>
+            <m:nor/>
+          </m:rPr>
+          <m:t>Down</m:t>
+        </m:r>
+        <m:r>
+          <w:rPr>
+            <w:rFonts w:ascii="Cambria Math" w:hAnsi="Cambria Math"/>
+          </w:rPr>
+          <m:t>→</m:t>
+        </m:r>
+        <m:r>
+          <m:rPr>
+            <m:nor/>
+          </m:rPr>
+          <m:t>Init</m:t>
+        </m:r>
+        <m:r>
+          <w:rPr>
+            <w:rFonts w:ascii="Cambria Math" w:hAnsi="Cambria Math"/>
+          </w:rPr>
+          <m:t>→</m:t>
+        </m:r>
+        <m:r>
+          <m:rPr>
+            <m:nor/>
+          </m:rPr>
+          <m:t>2-Way</m:t>
+        </m:r>
+        <m:r>
+          <w:rPr>
+            <w:rFonts w:ascii="Cambria Math" w:hAnsi="Cambria Math"/>
+          </w:rPr>
+          <m:t>→</m:t>
+        </m:r>
+        <m:r>
+          <m:rPr>
+            <m:nor/>
+          </m:rPr>
+          <m:t>ExStart</m:t>
+        </m:r>
+        <m:r>
+          <w:rPr>
+            <w:rFonts w:ascii="Cambria Math" w:hAnsi="Cambria Math"/>
+          </w:rPr>
+          <m:t>→</m:t>
+        </m:r>
+        <m:r>
+          <m:rPr>
+            <m:nor/>
+          </m:rPr>
+          <m:t>Exchange</m:t>
+        </m:r>
+        <m:r>
+          <w:rPr>
+            <w:rFonts w:ascii="Cambria Math" w:hAnsi="Cambria Math"/>
+          </w:rPr>
+          <m:t>→</m:t>
+        </m:r>
+        <m:r>
+          <m:rPr>
+            <m:nor/>
+          </m:rPr>
+          <m:t>Loading</m:t>
+        </m:r>
+        <m:r>
+          <w:rPr>
+            <w:rFonts w:ascii="Cambria Math" w:hAnsi="Cambria Math"/>
+          </w:rPr>
+          <m:t>→</m:t>
+        </m:r>
+        <m:r>
+          <m:rPr>
+            <m:nor/>
+          </m:rPr>
+          <m:t>Full</m:t>
+        </m:r>
+      </m:oMath>
+      <w:r>
+        <w:t>) and governs periodic actions via Hello, Dead, Expiration, and Garbage Collection timers.</w:t>
+      </w:r>
+    </w:p>
+    <w:p>
+      <w:pPr>
+        <w:pStyle w:val="NormalWeb"/>
+        <w:spacing w:before="0" w:beforeAutospacing="0"/>
+        <w:rPr>
+          <w:rFonts w:ascii="Arial" w:hAnsi="Arial" w:cs="Arial"/>
+        </w:rPr>
+      </w:pPr>
+      <w:r>
+        <w:rPr>
+          <w:rFonts w:ascii="Arial" w:hAnsi="Arial" w:cs="Arial"/>
+        </w:rPr>
+        <w:t xml:space="preserve">A </w:t>
+      </w:r>
+      <w:r>
+        <w:rPr>
+          <w:rFonts w:ascii="Arial" w:hAnsi="Arial" w:cs="Arial"/>
+          <w:b/>
+          <w:bCs/>
+        </w:rPr>
+        <w:t>Router ID (RID)</w:t>
+      </w:r>
+      <w:r>
+        <w:rPr>
+          <w:rFonts w:ascii="Arial" w:hAnsi="Arial" w:cs="Arial"/>
+        </w:rPr>
+        <w:t xml:space="preserve"> is a unique 32-bit number—formatted like an IPv4 address (e.g., </w:t>
+      </w:r>
+      <w:r>
+        <w:rPr>
+          <w:rStyle w:val="HTMLCode"/>
+          <w:rFonts w:ascii="Arial" w:hAnsi="Arial" w:cs="Arial"/>
+        </w:rPr>
+        <w:t>1.1.1.1</w:t>
+      </w:r>
+      <w:r>
+        <w:rPr>
+          <w:rFonts w:ascii="Arial" w:hAnsi="Arial" w:cs="Arial"/>
+        </w:rPr>
+        <w:t>)—used to uniquely identify a router within an Interior Gateway Protocol (IGP) domain.</w:t>
+      </w:r>
+    </w:p>
+    <w:p>
+      <w:pPr>
+        <w:pStyle w:val="NormalWeb"/>
+        <w:spacing w:before="0" w:beforeAutospacing="0"/>
+        <w:rPr>
+          <w:rFonts w:ascii="Arial" w:hAnsi="Arial" w:cs="Arial"/>
+        </w:rPr>
+      </w:pPr>
+      <w:r>
+        <w:rPr>
+          <w:rFonts w:ascii="Arial" w:hAnsi="Arial" w:cs="Arial"/>
+          <w:b/>
+          <w:bCs/>
+        </w:rPr>
+        <w:t>Core Purposes of a Router ID</w:t>
+      </w:r>
+    </w:p>
+    <w:p>
+      <w:pPr>
+        <w:pStyle w:val="NormalWeb"/>
+        <w:numPr>
+          <w:ilvl w:val="0"/>
+          <w:numId w:val="17"/>
+        </w:numPr>
+        <w:spacing w:before="0" w:beforeAutospacing="0"/>
+        <w:rPr>
+          <w:rFonts w:ascii="Arial" w:hAnsi="Arial" w:cs="Arial"/>
+        </w:rPr>
+      </w:pPr>
+      <w:r>
+        <w:rPr>
+          <w:rFonts w:ascii="Arial" w:hAnsi="Arial" w:cs="Arial"/>
+          <w:b/>
+          <w:bCs/>
+        </w:rPr>
+        <w:t>Graph Node Identifier:</w:t>
+      </w:r>
+      <w:r>
+        <w:rPr>
+          <w:rFonts w:ascii="Arial" w:hAnsi="Arial" w:cs="Arial"/>
+        </w:rPr>
+        <w:t xml:space="preserve"> In link-state protocols (OSPF, IS-IS), the Router ID acts as the unique vertex name in the mathematical graph </w:t>
+      </w:r>
+      <m:oMath>
+        <m:r>
+          <w:rPr>
+            <w:rFonts w:ascii="Cambria Math" w:hAnsi="Cambria Math" w:cs="Arial"/>
+          </w:rPr>
+          <m:t>G=</m:t>
+        </m:r>
+        <m:d>
+          <m:dPr>
+            <m:ctrlPr>
+              <w:rPr>
+                <w:rFonts w:ascii="Cambria Math" w:hAnsi="Cambria Math" w:cs="Arial"/>
+              </w:rPr>
+            </m:ctrlPr>
+          </m:dPr>
+          <m:e>
+            <m:r>
+              <w:rPr>
+                <w:rFonts w:ascii="Cambria Math" w:hAnsi="Cambria Math" w:cs="Arial"/>
+              </w:rPr>
+              <m:t>V,E</m:t>
+            </m:r>
+          </m:e>
+        </m:d>
+      </m:oMath>
+      <w:r>
+        <w:rPr>
+          <w:rFonts w:ascii="Arial" w:hAnsi="Arial" w:cs="Arial"/>
+        </w:rPr>
+        <w:t xml:space="preserve"> when running Dijkstra's algorithm.</w:t>
+      </w:r>
+    </w:p>
+    <w:p>
+      <w:pPr>
+        <w:pStyle w:val="NormalWeb"/>
+        <w:numPr>
+          <w:ilvl w:val="0"/>
+          <w:numId w:val="17"/>
+        </w:numPr>
+        <w:spacing w:before="0" w:beforeAutospacing="0"/>
+        <w:rPr>
+          <w:rFonts w:ascii="Arial" w:hAnsi="Arial" w:cs="Arial"/>
+        </w:rPr>
+      </w:pPr>
+      <w:r>
+        <w:rPr>
+          <w:rFonts w:ascii="Arial" w:hAnsi="Arial" w:cs="Arial"/>
+          <w:b/>
+          <w:bCs/>
+        </w:rPr>
+        <w:t>LSDB Ownership:</w:t>
+      </w:r>
+      <w:r>
+        <w:rPr>
+          <w:rFonts w:ascii="Arial" w:hAnsi="Arial" w:cs="Arial"/>
+        </w:rPr>
+        <w:t xml:space="preserve"> Links every Link-State Advertisement (LSA) to the specific router that generated it inside the Link-State Database (LSDB).</w:t>
+      </w:r>
+    </w:p>
+    <w:p>
+      <w:pPr>
+        <w:pStyle w:val="NormalWeb"/>
+        <w:numPr>
+          <w:ilvl w:val="0"/>
+          <w:numId w:val="17"/>
+        </w:numPr>
+        <w:spacing w:before="0" w:beforeAutospacing="0"/>
+        <w:rPr>
+          <w:rFonts w:ascii="Arial" w:hAnsi="Arial" w:cs="Arial"/>
+        </w:rPr>
+      </w:pPr>
+      <w:r>
+        <w:rPr>
+          <w:rFonts w:ascii="Arial" w:hAnsi="Arial" w:cs="Arial"/>
+          <w:b/>
+          <w:bCs/>
+        </w:rPr>
+        <w:t>DR/BDR Tie-Breaker:</w:t>
+      </w:r>
+      <w:r>
+        <w:rPr>
+          <w:rFonts w:ascii="Arial" w:hAnsi="Arial" w:cs="Arial"/>
+        </w:rPr>
+        <w:t xml:space="preserve"> In multi-access broadcast networks (like Ethernet), if all routers have equal priority, the router with the </w:t>
+      </w:r>
+      <w:r>
+        <w:rPr>
+          <w:rFonts w:ascii="Arial" w:hAnsi="Arial" w:cs="Arial"/>
+          <w:b/>
+          <w:bCs/>
+        </w:rPr>
+        <w:t>highest Router ID</w:t>
+      </w:r>
+      <w:r>
+        <w:rPr>
+          <w:rFonts w:ascii="Arial" w:hAnsi="Arial" w:cs="Arial"/>
+        </w:rPr>
+        <w:t xml:space="preserve"> is elected as the Designated Router (DR).</w:t>
+      </w:r>
+    </w:p>
+    <w:p>
+      <w:pPr>
+        <w:pStyle w:val="NormalWeb"/>
+        <w:numPr>
+          <w:ilvl w:val="0"/>
+          <w:numId w:val="17"/>
+        </w:numPr>
+        <w:spacing w:before="0" w:beforeAutospacing="0"/>
+        <w:rPr>
+          <w:rFonts w:ascii="Arial" w:hAnsi="Arial" w:cs="Arial"/>
+        </w:rPr>
+      </w:pPr>
+      <w:r>
+        <w:rPr>
+          <w:rFonts w:ascii="Arial" w:hAnsi="Arial" w:cs="Arial"/>
+          <w:b/>
+          <w:bCs/>
+        </w:rPr>
+        <w:lastRenderedPageBreak/>
+        <w:t>Adjacency Formation:</w:t>
+      </w:r>
+      <w:r>
+        <w:rPr>
+          <w:rFonts w:ascii="Arial" w:hAnsi="Arial" w:cs="Arial"/>
+        </w:rPr>
+        <w:t xml:space="preserve"> Used in Hello packets to establish, verify, and maintain peer relationships with adjacent routers</w:t>
+      </w:r>
+    </w:p>
+    <w:p>
+      <w:pPr>
+        <w:ind w:left="720"/>
+      </w:pPr>
+      <w:r>
+        <w:rPr>
+          <w:b/>
+          <w:bCs/>
+        </w:rPr>
+        <w:t>Types of IGP Packets</w:t>
+      </w:r>
+    </w:p>
+    <w:p>
+      <w:pPr>
+        <w:ind w:left="720"/>
+      </w:pPr>
+      <w:r>
+        <w:t>Control packets allow IGPs to discover peers, synchronize databases, and update route changes across an Autonomous System.</w:t>
+      </w:r>
+    </w:p>
+    <w:p>
+      <w:pPr>
+        <w:ind w:left="720"/>
+      </w:pPr>
+      <w:r>
+        <w:rPr>
+          <w:b/>
+          <w:bCs/>
+        </w:rPr>
+        <w:t>1. OSPF Packet Types (Link-State)</w:t>
+      </w:r>
+    </w:p>
+    <w:p>
+      <w:pPr>
+        <w:numPr>
+          <w:ilvl w:val="0"/>
+          <w:numId w:val="18"/>
+        </w:numPr>
+      </w:pPr>
+      <w:r>
+        <w:rPr>
+          <w:b/>
+          <w:bCs/>
+        </w:rPr>
+        <w:t>Type 1: Hello Packet</w:t>
+      </w:r>
+    </w:p>
+    <w:p>
+      <w:pPr>
+        <w:numPr>
+          <w:ilvl w:val="1"/>
+          <w:numId w:val="18"/>
+        </w:numPr>
+      </w:pPr>
+      <w:r>
+        <w:rPr>
+          <w:i/>
+          <w:iCs/>
+        </w:rPr>
+        <w:t>Purpose:</w:t>
+      </w:r>
+      <w:r>
+        <w:t xml:space="preserve"> Discovers </w:t>
+      </w:r>
+      <w:r>
+        <w:t>neighbours</w:t>
+      </w:r>
+      <w:r>
+        <w:t>, establishes adjacencies, elects Designated Routers (DR) and Backup Designated Routers (BDR) on multi-access networks, and serves as a periodic keepalive.</w:t>
+      </w:r>
+    </w:p>
+    <w:p>
+      <w:pPr>
+        <w:numPr>
+          <w:ilvl w:val="0"/>
+          <w:numId w:val="18"/>
+        </w:numPr>
+      </w:pPr>
+      <w:r>
+        <w:rPr>
+          <w:b/>
+          <w:bCs/>
+        </w:rPr>
+        <w:t>Type 2: Database Description (DBD / DDP)</w:t>
+      </w:r>
+    </w:p>
+    <w:p>
+      <w:pPr>
+        <w:numPr>
+          <w:ilvl w:val="1"/>
+          <w:numId w:val="18"/>
+        </w:numPr>
+      </w:pPr>
+      <w:r>
+        <w:rPr>
+          <w:i/>
+          <w:iCs/>
+        </w:rPr>
+        <w:t>Purpose:</w:t>
+      </w:r>
+      <w:r>
+        <w:t xml:space="preserve"> Exchanged during initial database sync; contains summary headers of the router's LSDB so </w:t>
+      </w:r>
+      <w:r>
+        <w:t>neighbours</w:t>
+      </w:r>
+      <w:r>
+        <w:t xml:space="preserve"> can check for missing or outdated LSAs.</w:t>
+      </w:r>
+    </w:p>
+    <w:p>
+      <w:pPr>
+        <w:numPr>
+          <w:ilvl w:val="0"/>
+          <w:numId w:val="18"/>
+        </w:numPr>
+      </w:pPr>
+      <w:r>
+        <w:rPr>
+          <w:b/>
+          <w:bCs/>
+        </w:rPr>
+        <w:t>Type 3: Link-State Request (LSR)</w:t>
+      </w:r>
+    </w:p>
+    <w:p>
+      <w:pPr>
+        <w:numPr>
+          <w:ilvl w:val="1"/>
+          <w:numId w:val="18"/>
+        </w:numPr>
+      </w:pPr>
+      <w:r>
+        <w:rPr>
+          <w:i/>
+          <w:iCs/>
+        </w:rPr>
+        <w:t>Purpose:</w:t>
+      </w:r>
+      <w:r>
+        <w:t xml:space="preserve"> Sent by a router to request detailed, updated LSA records after discovering missing entries in a received DBD.</w:t>
+      </w:r>
+    </w:p>
+    <w:p>
+      <w:pPr>
+        <w:numPr>
+          <w:ilvl w:val="0"/>
+          <w:numId w:val="18"/>
+        </w:numPr>
+      </w:pPr>
+      <w:r>
+        <w:rPr>
+          <w:b/>
+          <w:bCs/>
+        </w:rPr>
+        <w:t>Type 4: Link-State Update (LSU)</w:t>
+      </w:r>
+    </w:p>
+    <w:p>
+      <w:pPr>
+        <w:numPr>
+          <w:ilvl w:val="1"/>
+          <w:numId w:val="18"/>
+        </w:numPr>
+      </w:pPr>
+      <w:r>
+        <w:rPr>
+          <w:i/>
+          <w:iCs/>
+        </w:rPr>
+        <w:t>Purpose:</w:t>
+      </w:r>
+      <w:r>
+        <w:t xml:space="preserve"> Carries full, detailed LSAs to update </w:t>
+      </w:r>
+      <w:r>
+        <w:t>neighbouring</w:t>
+      </w:r>
+      <w:r>
+        <w:t xml:space="preserve"> databases. Used during database initialization and for immediate, triggered flooding when topology changes occur.</w:t>
+      </w:r>
+    </w:p>
+    <w:p>
+      <w:pPr>
+        <w:numPr>
+          <w:ilvl w:val="0"/>
+          <w:numId w:val="18"/>
+        </w:numPr>
+      </w:pPr>
+      <w:r>
+        <w:rPr>
+          <w:b/>
+          <w:bCs/>
+        </w:rPr>
+        <w:t>Type 5: Link-State Acknowledgment (</w:t>
+      </w:r>
+      <w:proofErr w:type="spellStart"/>
+      <w:r>
+        <w:rPr>
+          <w:b/>
+          <w:bCs/>
+        </w:rPr>
+        <w:t>LSAck</w:t>
+      </w:r>
+      <w:proofErr w:type="spellEnd"/>
+      <w:r>
+        <w:rPr>
+          <w:b/>
+          <w:bCs/>
+        </w:rPr>
+        <w:t>)</w:t>
+      </w:r>
+    </w:p>
+    <w:p>
+      <w:pPr>
+        <w:numPr>
+          <w:ilvl w:val="1"/>
+          <w:numId w:val="18"/>
+        </w:numPr>
+      </w:pPr>
+      <w:r>
+        <w:rPr>
+          <w:i/>
+          <w:iCs/>
+        </w:rPr>
+        <w:t>Purpose:</w:t>
+      </w:r>
+      <w:r>
+        <w:t xml:space="preserve"> Explicitly acknowledges the receipt of LSU packets to guarantee reliable transfer over the network.</w:t>
+      </w:r>
+    </w:p>
+    <w:p>
+      <w:pPr>
+        <w:ind w:left="720"/>
+      </w:pPr>
+      <w:r>
+        <w:rPr>
+          <w:b/>
+          <w:bCs/>
+        </w:rPr>
+        <w:t>2. RIP Packet Types (Distance-Vector)</w:t>
+      </w:r>
+    </w:p>
+    <w:p>
+      <w:pPr>
+        <w:numPr>
+          <w:ilvl w:val="0"/>
+          <w:numId w:val="19"/>
+        </w:numPr>
+      </w:pPr>
+      <w:r>
+        <w:rPr>
+          <w:b/>
+          <w:bCs/>
+        </w:rPr>
+        <w:t>Request Message (Command 1):</w:t>
+      </w:r>
+      <w:r>
+        <w:t xml:space="preserve"> Broadcasted/multicast by a newly booted or reset router to solicit routing updates from adjacent </w:t>
+      </w:r>
+      <w:r>
+        <w:t>neighbours</w:t>
+      </w:r>
+      <w:r>
+        <w:t>.</w:t>
+      </w:r>
+    </w:p>
+    <w:p>
+      <w:pPr>
+        <w:numPr>
+          <w:ilvl w:val="0"/>
+          <w:numId w:val="19"/>
+        </w:numPr>
+      </w:pPr>
+      <w:r>
+        <w:rPr>
+          <w:b/>
+          <w:bCs/>
+        </w:rPr>
+        <w:t>Response Message (Command 2):</w:t>
+      </w:r>
+      <w:r>
+        <w:t xml:space="preserve"> Carries destination-metric vectors. Sent either periodically (every 30 seconds) or immediately as a triggered update/solicited reply.</w:t>
+      </w:r>
+    </w:p>
+    <w:p>
+      <w:pPr>
+        <w:ind w:left="720"/>
+      </w:pPr>
+      <w:r>
+        <w:rPr>
+          <w:b/>
+          <w:bCs/>
+        </w:rPr>
+        <w:t>3. IS-IS Packet Types (Layer 2 PDUs)</w:t>
+      </w:r>
+    </w:p>
+    <w:p>
+      <w:pPr>
+        <w:numPr>
+          <w:ilvl w:val="0"/>
+          <w:numId w:val="20"/>
+        </w:numPr>
+      </w:pPr>
+      <w:r>
+        <w:rPr>
+          <w:b/>
+          <w:bCs/>
+        </w:rPr>
+        <w:t>IS-IS Hello PDU (IIH):</w:t>
+      </w:r>
+      <w:r>
+        <w:t xml:space="preserve"> Used to establish and maintain link-layer adjacencies with </w:t>
+      </w:r>
+      <w:r>
+        <w:t>neighbouring</w:t>
+      </w:r>
+      <w:r>
+        <w:t xml:space="preserve"> routers.</w:t>
+      </w:r>
+    </w:p>
+    <w:p>
+      <w:pPr>
+        <w:numPr>
+          <w:ilvl w:val="0"/>
+          <w:numId w:val="20"/>
+        </w:numPr>
+      </w:pPr>
+      <w:r>
+        <w:rPr>
+          <w:b/>
+          <w:bCs/>
+        </w:rPr>
+        <w:t>Link State PDU (LSP):</w:t>
+      </w:r>
+      <w:r>
+        <w:t xml:space="preserve"> Contains state, interface, and metric information; equivalent to an OSPF LSA/LSU combined.</w:t>
+      </w:r>
+    </w:p>
+    <w:p>
+      <w:pPr>
+        <w:numPr>
+          <w:ilvl w:val="0"/>
+          <w:numId w:val="20"/>
+        </w:numPr>
+      </w:pPr>
+      <w:r>
+        <w:rPr>
+          <w:b/>
+          <w:bCs/>
+        </w:rPr>
+        <w:t>Complete Sequence Number PDU (CSNP):</w:t>
+      </w:r>
+      <w:r>
+        <w:t xml:space="preserve"> Contains a list of all LSPs in the sender's database to maintain synchronization across the area (equivalent to an OSPF DBD).</w:t>
+      </w:r>
+    </w:p>
+    <w:p>
+      <w:pPr>
+        <w:numPr>
+          <w:ilvl w:val="0"/>
+          <w:numId w:val="20"/>
+        </w:numPr>
+      </w:pPr>
+      <w:r>
+        <w:rPr>
+          <w:b/>
+          <w:bCs/>
+        </w:rPr>
+        <w:lastRenderedPageBreak/>
+        <w:t>Partial Sequence Number PDU (PSNP):</w:t>
+      </w:r>
+      <w:r>
+        <w:t xml:space="preserve"> Used to request missing LSPs or acknowledge received LSPs (combines the roles of OSPF LSR and </w:t>
+      </w:r>
+      <w:proofErr w:type="spellStart"/>
+      <w:r>
+        <w:t>LSAck</w:t>
+      </w:r>
+      <w:proofErr w:type="spellEnd"/>
+      <w:r>
+        <w:t>).</w:t>
+      </w:r>
+    </w:p>
+    <w:p>
+      <w:pPr>
+        <w:ind w:left="720"/>
+      </w:pPr>
+    </w:p>
+    <w:p>
+      <w:pPr>
         <w:rPr>
           <w:b/>
           <w:bCs/>
@@ -911,7 +1788,6 @@
           <w:b/>
           <w:bCs/>
         </w:rPr>
-        <w:lastRenderedPageBreak/>
         <w:t>Hello (Type 1):</w:t>
       </w:r>
       <w:r>
@@ -938,6 +1814,7 @@
           <w:b/>
           <w:bCs/>
         </w:rPr>
+        <w:lastRenderedPageBreak/>
         <w:t>DBD / DDP (Database Description - Type 2):</w:t>
       </w:r>
       <w:r>
@@ -1870,7 +2747,6 @@
           <w:lang w:eastAsia="en-IN" w:bidi="ar-SA"/>
           <w14:ligatures w14:val="none"/>
         </w:rPr>
-        <w:lastRenderedPageBreak/>
         <w:t>Definition:</w:t>
       </w:r>
       <w:r>
@@ -1962,6 +2838,7 @@
           <w:lang w:eastAsia="en-IN" w:bidi="ar-SA"/>
           <w14:ligatures w14:val="none"/>
         </w:rPr>
+        <w:lastRenderedPageBreak/>
         <w:t>Role:</w:t>
       </w:r>
       <w:r>
@@ -3486,7 +4363,6 @@
           <w:lang w:eastAsia="en-IN" w:bidi="ar-SA"/>
           <w14:ligatures w14:val="none"/>
         </w:rPr>
-        <w:lastRenderedPageBreak/>
         <w:t>NOTIFICATION Packet</w:t>
       </w:r>
     </w:p>
@@ -3543,6 +4419,7 @@
           <w:lang w:eastAsia="en-IN" w:bidi="ar-SA"/>
           <w14:ligatures w14:val="none"/>
         </w:rPr>
+        <w:lastRenderedPageBreak/>
         <w:t>Terminates the session.</w:t>
       </w:r>
     </w:p>
@@ -4469,6 +5346,155 @@
     </w:lvl>
   </w:abstractNum>
   <w:abstractNum w:abstractNumId="6" w15:restartNumberingAfterBreak="0">
+    <w:nsid w:val="2C574AF8"/>
+    <w:multiLevelType w:val="multilevel"/>
+    <w:tmpl w:val="A1A25A5C"/>
+    <w:lvl w:ilvl="0">
+      <w:start w:val="1"/>
+      <w:numFmt w:val="bullet"/>
+      <w:lvlText w:val=""/>
+      <w:lvlJc w:val="left"/>
+      <w:pPr>
+        <w:tabs>
+          <w:tab w:val="num" w:pos="720"/>
+        </w:tabs>
+        <w:ind w:left="720" w:hanging="360"/>
+      </w:pPr>
+      <w:rPr>
+        <w:rFonts w:ascii="Symbol" w:hAnsi="Symbol" w:hint="default"/>
+        <w:sz w:val="20"/>
+      </w:rPr>
+    </w:lvl>
+    <w:lvl w:ilvl="1" w:tentative="1">
+      <w:start w:val="1"/>
+      <w:numFmt w:val="bullet"/>
+      <w:lvlText w:val="o"/>
+      <w:lvlJc w:val="left"/>
+      <w:pPr>
+        <w:tabs>
+          <w:tab w:val="num" w:pos="1440"/>
+        </w:tabs>
+        <w:ind w:left="1440" w:hanging="360"/>
+      </w:pPr>
+      <w:rPr>
+        <w:rFonts w:ascii="Courier New" w:hAnsi="Courier New" w:hint="default"/>
+        <w:sz w:val="20"/>
+      </w:rPr>
+    </w:lvl>
+    <w:lvl w:ilvl="2" w:tentative="1">
+      <w:start w:val="1"/>
+      <w:numFmt w:val="bullet"/>
+      <w:lvlText w:val=""/>
+      <w:lvlJc w:val="left"/>
+      <w:pPr>
+        <w:tabs>
+          <w:tab w:val="num" w:pos="2160"/>
+        </w:tabs>
+        <w:ind w:left="2160" w:hanging="360"/>
+      </w:pPr>
+      <w:rPr>
+        <w:rFonts w:ascii="Wingdings" w:hAnsi="Wingdings" w:hint="default"/>
+        <w:sz w:val="20"/>
+      </w:rPr>
+    </w:lvl>
+    <w:lvl w:ilvl="3" w:tentative="1">
+      <w:start w:val="1"/>
+      <w:numFmt w:val="bullet"/>
+      <w:lvlText w:val=""/>
+      <w:lvlJc w:val="left"/>
+      <w:pPr>
+        <w:tabs>
+          <w:tab w:val="num" w:pos="2880"/>
+        </w:tabs>
+        <w:ind w:left="2880" w:hanging="360"/>
+      </w:pPr>
+      <w:rPr>
+        <w:rFonts w:ascii="Wingdings" w:hAnsi="Wingdings" w:hint="default"/>
+        <w:sz w:val="20"/>
+      </w:rPr>
+    </w:lvl>
+    <w:lvl w:ilvl="4" w:tentative="1">
+      <w:start w:val="1"/>
+      <w:numFmt w:val="bullet"/>
+      <w:lvlText w:val=""/>
+      <w:lvlJc w:val="left"/>
+      <w:pPr>
+        <w:tabs>
+          <w:tab w:val="num" w:pos="3600"/>
+        </w:tabs>
+        <w:ind w:left="3600" w:hanging="360"/>
+      </w:pPr>
+      <w:rPr>
+        <w:rFonts w:ascii="Wingdings" w:hAnsi="Wingdings" w:hint="default"/>
+        <w:sz w:val="20"/>
+      </w:rPr>
+    </w:lvl>
+    <w:lvl w:ilvl="5" w:tentative="1">
+      <w:start w:val="1"/>
+      <w:numFmt w:val="bullet"/>
+      <w:lvlText w:val=""/>
+      <w:lvlJc w:val="left"/>
+      <w:pPr>
+        <w:tabs>
+          <w:tab w:val="num" w:pos="4320"/>
+        </w:tabs>
+        <w:ind w:left="4320" w:hanging="360"/>
+      </w:pPr>
+      <w:rPr>
+        <w:rFonts w:ascii="Wingdings" w:hAnsi="Wingdings" w:hint="default"/>
+        <w:sz w:val="20"/>
+      </w:rPr>
+    </w:lvl>
+    <w:lvl w:ilvl="6" w:tentative="1">
+      <w:start w:val="1"/>
+      <w:numFmt w:val="bullet"/>
+      <w:lvlText w:val=""/>
+      <w:lvlJc w:val="left"/>
+      <w:pPr>
+        <w:tabs>
+          <w:tab w:val="num" w:pos="5040"/>
+        </w:tabs>
+        <w:ind w:left="5040" w:hanging="360"/>
+      </w:pPr>
+      <w:rPr>
+        <w:rFonts w:ascii="Wingdings" w:hAnsi="Wingdings" w:hint="default"/>
+        <w:sz w:val="20"/>
+      </w:rPr>
+    </w:lvl>
+    <w:lvl w:ilvl="7" w:tentative="1">
+      <w:start w:val="1"/>
+      <w:numFmt w:val="bullet"/>
+      <w:lvlText w:val=""/>
+      <w:lvlJc w:val="left"/>
+      <w:pPr>
+        <w:tabs>
+          <w:tab w:val="num" w:pos="5760"/>
+        </w:tabs>
+        <w:ind w:left="5760" w:hanging="360"/>
+      </w:pPr>
+      <w:rPr>
+        <w:rFonts w:ascii="Wingdings" w:hAnsi="Wingdings" w:hint="default"/>
+        <w:sz w:val="20"/>
+      </w:rPr>
+    </w:lvl>
+    <w:lvl w:ilvl="8" w:tentative="1">
+      <w:start w:val="1"/>
+      <w:numFmt w:val="bullet"/>
+      <w:lvlText w:val=""/>
+      <w:lvlJc w:val="left"/>
+      <w:pPr>
+        <w:tabs>
+          <w:tab w:val="num" w:pos="6480"/>
+        </w:tabs>
+        <w:ind w:left="6480" w:hanging="360"/>
+      </w:pPr>
+      <w:rPr>
+        <w:rFonts w:ascii="Wingdings" w:hAnsi="Wingdings" w:hint="default"/>
+        <w:sz w:val="20"/>
+      </w:rPr>
+    </w:lvl>
+  </w:abstractNum>
+  <w:abstractNum w:abstractNumId="7" w15:restartNumberingAfterBreak="0">
     <w:nsid w:val="2DF67318"/>
     <w:multiLevelType w:val="multilevel"/>
     <w:tmpl w:val="792C33F0"/>
@@ -4617,7 +5643,7 @@
       </w:rPr>
     </w:lvl>
   </w:abstractNum>
-  <w:abstractNum w:abstractNumId="7" w15:restartNumberingAfterBreak="0">
+  <w:abstractNum w:abstractNumId="8" w15:restartNumberingAfterBreak="0">
     <w:nsid w:val="363C5F7B"/>
     <w:multiLevelType w:val="multilevel"/>
     <w:tmpl w:val="5CE64CE0"/>
@@ -4762,7 +5788,156 @@
       </w:rPr>
     </w:lvl>
   </w:abstractNum>
-  <w:abstractNum w:abstractNumId="8" w15:restartNumberingAfterBreak="0">
+  <w:abstractNum w:abstractNumId="9" w15:restartNumberingAfterBreak="0">
+    <w:nsid w:val="3D220B96"/>
+    <w:multiLevelType w:val="multilevel"/>
+    <w:tmpl w:val="5A200722"/>
+    <w:lvl w:ilvl="0">
+      <w:start w:val="1"/>
+      <w:numFmt w:val="bullet"/>
+      <w:lvlText w:val=""/>
+      <w:lvlJc w:val="left"/>
+      <w:pPr>
+        <w:tabs>
+          <w:tab w:val="num" w:pos="720"/>
+        </w:tabs>
+        <w:ind w:left="720" w:hanging="360"/>
+      </w:pPr>
+      <w:rPr>
+        <w:rFonts w:ascii="Symbol" w:hAnsi="Symbol" w:hint="default"/>
+        <w:sz w:val="20"/>
+      </w:rPr>
+    </w:lvl>
+    <w:lvl w:ilvl="1">
+      <w:start w:val="1"/>
+      <w:numFmt w:val="bullet"/>
+      <w:lvlText w:val="o"/>
+      <w:lvlJc w:val="left"/>
+      <w:pPr>
+        <w:tabs>
+          <w:tab w:val="num" w:pos="1440"/>
+        </w:tabs>
+        <w:ind w:left="1440" w:hanging="360"/>
+      </w:pPr>
+      <w:rPr>
+        <w:rFonts w:ascii="Courier New" w:hAnsi="Courier New" w:hint="default"/>
+        <w:sz w:val="20"/>
+      </w:rPr>
+    </w:lvl>
+    <w:lvl w:ilvl="2" w:tentative="1">
+      <w:start w:val="1"/>
+      <w:numFmt w:val="bullet"/>
+      <w:lvlText w:val=""/>
+      <w:lvlJc w:val="left"/>
+      <w:pPr>
+        <w:tabs>
+          <w:tab w:val="num" w:pos="2160"/>
+        </w:tabs>
+        <w:ind w:left="2160" w:hanging="360"/>
+      </w:pPr>
+      <w:rPr>
+        <w:rFonts w:ascii="Wingdings" w:hAnsi="Wingdings" w:hint="default"/>
+        <w:sz w:val="20"/>
+      </w:rPr>
+    </w:lvl>
+    <w:lvl w:ilvl="3" w:tentative="1">
+      <w:start w:val="1"/>
+      <w:numFmt w:val="bullet"/>
+      <w:lvlText w:val=""/>
+      <w:lvlJc w:val="left"/>
+      <w:pPr>
+        <w:tabs>
+          <w:tab w:val="num" w:pos="2880"/>
+        </w:tabs>
+        <w:ind w:left="2880" w:hanging="360"/>
+      </w:pPr>
+      <w:rPr>
+        <w:rFonts w:ascii="Wingdings" w:hAnsi="Wingdings" w:hint="default"/>
+        <w:sz w:val="20"/>
+      </w:rPr>
+    </w:lvl>
+    <w:lvl w:ilvl="4" w:tentative="1">
+      <w:start w:val="1"/>
+      <w:numFmt w:val="bullet"/>
+      <w:lvlText w:val=""/>
+      <w:lvlJc w:val="left"/>
+      <w:pPr>
+        <w:tabs>
+          <w:tab w:val="num" w:pos="3600"/>
+        </w:tabs>
+        <w:ind w:left="3600" w:hanging="360"/>
+      </w:pPr>
+      <w:rPr>
+        <w:rFonts w:ascii="Wingdings" w:hAnsi="Wingdings" w:hint="default"/>
+        <w:sz w:val="20"/>
+      </w:rPr>
+    </w:lvl>
+    <w:lvl w:ilvl="5" w:tentative="1">
+      <w:start w:val="1"/>
+      <w:numFmt w:val="bullet"/>
+      <w:lvlText w:val=""/>
+      <w:lvlJc w:val="left"/>
+      <w:pPr>
+        <w:tabs>
+          <w:tab w:val="num" w:pos="4320"/>
+        </w:tabs>
+        <w:ind w:left="4320" w:hanging="360"/>
+      </w:pPr>
+      <w:rPr>
+        <w:rFonts w:ascii="Wingdings" w:hAnsi="Wingdings" w:hint="default"/>
+        <w:sz w:val="20"/>
+      </w:rPr>
+    </w:lvl>
+    <w:lvl w:ilvl="6" w:tentative="1">
+      <w:start w:val="1"/>
+      <w:numFmt w:val="bullet"/>
+      <w:lvlText w:val=""/>
+      <w:lvlJc w:val="left"/>
+      <w:pPr>
+        <w:tabs>
+          <w:tab w:val="num" w:pos="5040"/>
+        </w:tabs>
+        <w:ind w:left="5040" w:hanging="360"/>
+      </w:pPr>
+      <w:rPr>
+        <w:rFonts w:ascii="Wingdings" w:hAnsi="Wingdings" w:hint="default"/>
+        <w:sz w:val="20"/>
+      </w:rPr>
+    </w:lvl>
+    <w:lvl w:ilvl="7" w:tentative="1">
+      <w:start w:val="1"/>
+      <w:numFmt w:val="bullet"/>
+      <w:lvlText w:val=""/>
+      <w:lvlJc w:val="left"/>
+      <w:pPr>
+        <w:tabs>
+          <w:tab w:val="num" w:pos="5760"/>
+        </w:tabs>
+        <w:ind w:left="5760" w:hanging="360"/>
+      </w:pPr>
+      <w:rPr>
+        <w:rFonts w:ascii="Wingdings" w:hAnsi="Wingdings" w:hint="default"/>
+        <w:sz w:val="20"/>
+      </w:rPr>
+    </w:lvl>
+    <w:lvl w:ilvl="8" w:tentative="1">
+      <w:start w:val="1"/>
+      <w:numFmt w:val="bullet"/>
+      <w:lvlText w:val=""/>
+      <w:lvlJc w:val="left"/>
+      <w:pPr>
+        <w:tabs>
+          <w:tab w:val="num" w:pos="6480"/>
+        </w:tabs>
+        <w:ind w:left="6480" w:hanging="360"/>
+      </w:pPr>
+      <w:rPr>
+        <w:rFonts w:ascii="Wingdings" w:hAnsi="Wingdings" w:hint="default"/>
+        <w:sz w:val="20"/>
+      </w:rPr>
+    </w:lvl>
+  </w:abstractNum>
+  <w:abstractNum w:abstractNumId="10" w15:restartNumberingAfterBreak="0">
     <w:nsid w:val="3E503794"/>
     <w:multiLevelType w:val="multilevel"/>
     <w:tmpl w:val="ECA2A85C"/>
@@ -4911,7 +6086,156 @@
       </w:rPr>
     </w:lvl>
   </w:abstractNum>
-  <w:abstractNum w:abstractNumId="9" w15:restartNumberingAfterBreak="0">
+  <w:abstractNum w:abstractNumId="11" w15:restartNumberingAfterBreak="0">
+    <w:nsid w:val="40F130E8"/>
+    <w:multiLevelType w:val="multilevel"/>
+    <w:tmpl w:val="F18C312C"/>
+    <w:lvl w:ilvl="0">
+      <w:start w:val="1"/>
+      <w:numFmt w:val="bullet"/>
+      <w:lvlText w:val=""/>
+      <w:lvlJc w:val="left"/>
+      <w:pPr>
+        <w:tabs>
+          <w:tab w:val="num" w:pos="720"/>
+        </w:tabs>
+        <w:ind w:left="720" w:hanging="360"/>
+      </w:pPr>
+      <w:rPr>
+        <w:rFonts w:ascii="Symbol" w:hAnsi="Symbol" w:hint="default"/>
+        <w:sz w:val="20"/>
+      </w:rPr>
+    </w:lvl>
+    <w:lvl w:ilvl="1" w:tentative="1">
+      <w:start w:val="1"/>
+      <w:numFmt w:val="bullet"/>
+      <w:lvlText w:val="o"/>
+      <w:lvlJc w:val="left"/>
+      <w:pPr>
+        <w:tabs>
+          <w:tab w:val="num" w:pos="1440"/>
+        </w:tabs>
+        <w:ind w:left="1440" w:hanging="360"/>
+      </w:pPr>
+      <w:rPr>
+        <w:rFonts w:ascii="Courier New" w:hAnsi="Courier New" w:hint="default"/>
+        <w:sz w:val="20"/>
+      </w:rPr>
+    </w:lvl>
+    <w:lvl w:ilvl="2" w:tentative="1">
+      <w:start w:val="1"/>
+      <w:numFmt w:val="bullet"/>
+      <w:lvlText w:val=""/>
+      <w:lvlJc w:val="left"/>
+      <w:pPr>
+        <w:tabs>
+          <w:tab w:val="num" w:pos="2160"/>
+        </w:tabs>
+        <w:ind w:left="2160" w:hanging="360"/>
+      </w:pPr>
+      <w:rPr>
+        <w:rFonts w:ascii="Wingdings" w:hAnsi="Wingdings" w:hint="default"/>
+        <w:sz w:val="20"/>
+      </w:rPr>
+    </w:lvl>
+    <w:lvl w:ilvl="3" w:tentative="1">
+      <w:start w:val="1"/>
+      <w:numFmt w:val="bullet"/>
+      <w:lvlText w:val=""/>
+      <w:lvlJc w:val="left"/>
+      <w:pPr>
+        <w:tabs>
+          <w:tab w:val="num" w:pos="2880"/>
+        </w:tabs>
+        <w:ind w:left="2880" w:hanging="360"/>
+      </w:pPr>
+      <w:rPr>
+        <w:rFonts w:ascii="Wingdings" w:hAnsi="Wingdings" w:hint="default"/>
+        <w:sz w:val="20"/>
+      </w:rPr>
+    </w:lvl>
+    <w:lvl w:ilvl="4" w:tentative="1">
+      <w:start w:val="1"/>
+      <w:numFmt w:val="bullet"/>
+      <w:lvlText w:val=""/>
+      <w:lvlJc w:val="left"/>
+      <w:pPr>
+        <w:tabs>
+          <w:tab w:val="num" w:pos="3600"/>
+        </w:tabs>
+        <w:ind w:left="3600" w:hanging="360"/>
+      </w:pPr>
+      <w:rPr>
+        <w:rFonts w:ascii="Wingdings" w:hAnsi="Wingdings" w:hint="default"/>
+        <w:sz w:val="20"/>
+      </w:rPr>
+    </w:lvl>
+    <w:lvl w:ilvl="5" w:tentative="1">
+      <w:start w:val="1"/>
+      <w:numFmt w:val="bullet"/>
+      <w:lvlText w:val=""/>
+      <w:lvlJc w:val="left"/>
+      <w:pPr>
+        <w:tabs>
+          <w:tab w:val="num" w:pos="4320"/>
+        </w:tabs>
+        <w:ind w:left="4320" w:hanging="360"/>
+      </w:pPr>
+      <w:rPr>
+        <w:rFonts w:ascii="Wingdings" w:hAnsi="Wingdings" w:hint="default"/>
+        <w:sz w:val="20"/>
+      </w:rPr>
+    </w:lvl>
+    <w:lvl w:ilvl="6" w:tentative="1">
+      <w:start w:val="1"/>
+      <w:numFmt w:val="bullet"/>
+      <w:lvlText w:val=""/>
+      <w:lvlJc w:val="left"/>
+      <w:pPr>
+        <w:tabs>
+          <w:tab w:val="num" w:pos="5040"/>
+        </w:tabs>
+        <w:ind w:left="5040" w:hanging="360"/>
+      </w:pPr>
+      <w:rPr>
+        <w:rFonts w:ascii="Wingdings" w:hAnsi="Wingdings" w:hint="default"/>
+        <w:sz w:val="20"/>
+      </w:rPr>
+    </w:lvl>
+    <w:lvl w:ilvl="7" w:tentative="1">
+      <w:start w:val="1"/>
+      <w:numFmt w:val="bullet"/>
+      <w:lvlText w:val=""/>
+      <w:lvlJc w:val="left"/>
+      <w:pPr>
+        <w:tabs>
+          <w:tab w:val="num" w:pos="5760"/>
+        </w:tabs>
+        <w:ind w:left="5760" w:hanging="360"/>
+      </w:pPr>
+      <w:rPr>
+        <w:rFonts w:ascii="Wingdings" w:hAnsi="Wingdings" w:hint="default"/>
+        <w:sz w:val="20"/>
+      </w:rPr>
+    </w:lvl>
+    <w:lvl w:ilvl="8" w:tentative="1">
+      <w:start w:val="1"/>
+      <w:numFmt w:val="bullet"/>
+      <w:lvlText w:val=""/>
+      <w:lvlJc w:val="left"/>
+      <w:pPr>
+        <w:tabs>
+          <w:tab w:val="num" w:pos="6480"/>
+        </w:tabs>
+        <w:ind w:left="6480" w:hanging="360"/>
+      </w:pPr>
+      <w:rPr>
+        <w:rFonts w:ascii="Wingdings" w:hAnsi="Wingdings" w:hint="default"/>
+        <w:sz w:val="20"/>
+      </w:rPr>
+    </w:lvl>
+  </w:abstractNum>
+  <w:abstractNum w:abstractNumId="12" w15:restartNumberingAfterBreak="0">
     <w:nsid w:val="432B7AAD"/>
     <w:multiLevelType w:val="multilevel"/>
     <w:tmpl w:val="0A48B7CE"/>
@@ -5060,7 +6384,7 @@
       </w:rPr>
     </w:lvl>
   </w:abstractNum>
-  <w:abstractNum w:abstractNumId="10" w15:restartNumberingAfterBreak="0">
+  <w:abstractNum w:abstractNumId="13" w15:restartNumberingAfterBreak="0">
     <w:nsid w:val="4C7453BB"/>
     <w:multiLevelType w:val="multilevel"/>
     <w:tmpl w:val="F7D89D12"/>
@@ -5209,7 +6533,7 @@
       </w:rPr>
     </w:lvl>
   </w:abstractNum>
-  <w:abstractNum w:abstractNumId="11" w15:restartNumberingAfterBreak="0">
+  <w:abstractNum w:abstractNumId="14" w15:restartNumberingAfterBreak="0">
     <w:nsid w:val="51D638E3"/>
     <w:multiLevelType w:val="multilevel"/>
     <w:tmpl w:val="295884DC"/>
@@ -5358,7 +6682,156 @@
       </w:rPr>
     </w:lvl>
   </w:abstractNum>
-  <w:abstractNum w:abstractNumId="12" w15:restartNumberingAfterBreak="0">
+  <w:abstractNum w:abstractNumId="15" w15:restartNumberingAfterBreak="0">
+    <w:nsid w:val="58B44229"/>
+    <w:multiLevelType w:val="multilevel"/>
+    <w:tmpl w:val="BB94BB64"/>
+    <w:lvl w:ilvl="0">
+      <w:start w:val="1"/>
+      <w:numFmt w:val="bullet"/>
+      <w:lvlText w:val=""/>
+      <w:lvlJc w:val="left"/>
+      <w:pPr>
+        <w:tabs>
+          <w:tab w:val="num" w:pos="720"/>
+        </w:tabs>
+        <w:ind w:left="720" w:hanging="360"/>
+      </w:pPr>
+      <w:rPr>
+        <w:rFonts w:ascii="Symbol" w:hAnsi="Symbol" w:hint="default"/>
+        <w:sz w:val="20"/>
+      </w:rPr>
+    </w:lvl>
+    <w:lvl w:ilvl="1">
+      <w:start w:val="1"/>
+      <w:numFmt w:val="bullet"/>
+      <w:lvlText w:val="o"/>
+      <w:lvlJc w:val="left"/>
+      <w:pPr>
+        <w:tabs>
+          <w:tab w:val="num" w:pos="1440"/>
+        </w:tabs>
+        <w:ind w:left="1440" w:hanging="360"/>
+      </w:pPr>
+      <w:rPr>
+        <w:rFonts w:ascii="Courier New" w:hAnsi="Courier New" w:hint="default"/>
+        <w:sz w:val="20"/>
+      </w:rPr>
+    </w:lvl>
+    <w:lvl w:ilvl="2" w:tentative="1">
+      <w:start w:val="1"/>
+      <w:numFmt w:val="bullet"/>
+      <w:lvlText w:val=""/>
+      <w:lvlJc w:val="left"/>
+      <w:pPr>
+        <w:tabs>
+          <w:tab w:val="num" w:pos="2160"/>
+        </w:tabs>
+        <w:ind w:left="2160" w:hanging="360"/>
+      </w:pPr>
+      <w:rPr>
+        <w:rFonts w:ascii="Wingdings" w:hAnsi="Wingdings" w:hint="default"/>
+        <w:sz w:val="20"/>
+      </w:rPr>
+    </w:lvl>
+    <w:lvl w:ilvl="3" w:tentative="1">
+      <w:start w:val="1"/>
+      <w:numFmt w:val="bullet"/>
+      <w:lvlText w:val=""/>
+      <w:lvlJc w:val="left"/>
+      <w:pPr>
+        <w:tabs>
+          <w:tab w:val="num" w:pos="2880"/>
+        </w:tabs>
+        <w:ind w:left="2880" w:hanging="360"/>
+      </w:pPr>
+      <w:rPr>
+        <w:rFonts w:ascii="Wingdings" w:hAnsi="Wingdings" w:hint="default"/>
+        <w:sz w:val="20"/>
+      </w:rPr>
+    </w:lvl>
+    <w:lvl w:ilvl="4" w:tentative="1">
+      <w:start w:val="1"/>
+      <w:numFmt w:val="bullet"/>
+      <w:lvlText w:val=""/>
+      <w:lvlJc w:val="left"/>
+      <w:pPr>
+        <w:tabs>
+          <w:tab w:val="num" w:pos="3600"/>
+        </w:tabs>
+        <w:ind w:left="3600" w:hanging="360"/>
+      </w:pPr>
+      <w:rPr>
+        <w:rFonts w:ascii="Wingdings" w:hAnsi="Wingdings" w:hint="default"/>
+        <w:sz w:val="20"/>
+      </w:rPr>
+    </w:lvl>
+    <w:lvl w:ilvl="5" w:tentative="1">
+      <w:start w:val="1"/>
+      <w:numFmt w:val="bullet"/>
+      <w:lvlText w:val=""/>
+      <w:lvlJc w:val="left"/>
+      <w:pPr>
+        <w:tabs>
+          <w:tab w:val="num" w:pos="4320"/>
+        </w:tabs>
+        <w:ind w:left="4320" w:hanging="360"/>
+      </w:pPr>
+      <w:rPr>
+        <w:rFonts w:ascii="Wingdings" w:hAnsi="Wingdings" w:hint="default"/>
+        <w:sz w:val="20"/>
+      </w:rPr>
+    </w:lvl>
+    <w:lvl w:ilvl="6" w:tentative="1">
+      <w:start w:val="1"/>
+      <w:numFmt w:val="bullet"/>
+      <w:lvlText w:val=""/>
+      <w:lvlJc w:val="left"/>
+      <w:pPr>
+        <w:tabs>
+          <w:tab w:val="num" w:pos="5040"/>
+        </w:tabs>
+        <w:ind w:left="5040" w:hanging="360"/>
+      </w:pPr>
+      <w:rPr>
+        <w:rFonts w:ascii="Wingdings" w:hAnsi="Wingdings" w:hint="default"/>
+        <w:sz w:val="20"/>
+      </w:rPr>
+    </w:lvl>
+    <w:lvl w:ilvl="7" w:tentative="1">
+      <w:start w:val="1"/>
+      <w:numFmt w:val="bullet"/>
+      <w:lvlText w:val=""/>
+      <w:lvlJc w:val="left"/>
+      <w:pPr>
+        <w:tabs>
+          <w:tab w:val="num" w:pos="5760"/>
+        </w:tabs>
+        <w:ind w:left="5760" w:hanging="360"/>
+      </w:pPr>
+      <w:rPr>
+        <w:rFonts w:ascii="Wingdings" w:hAnsi="Wingdings" w:hint="default"/>
+        <w:sz w:val="20"/>
+      </w:rPr>
+    </w:lvl>
+    <w:lvl w:ilvl="8" w:tentative="1">
+      <w:start w:val="1"/>
+      <w:numFmt w:val="bullet"/>
+      <w:lvlText w:val=""/>
+      <w:lvlJc w:val="left"/>
+      <w:pPr>
+        <w:tabs>
+          <w:tab w:val="num" w:pos="6480"/>
+        </w:tabs>
+        <w:ind w:left="6480" w:hanging="360"/>
+      </w:pPr>
+      <w:rPr>
+        <w:rFonts w:ascii="Wingdings" w:hAnsi="Wingdings" w:hint="default"/>
+        <w:sz w:val="20"/>
+      </w:rPr>
+    </w:lvl>
+  </w:abstractNum>
+  <w:abstractNum w:abstractNumId="16" w15:restartNumberingAfterBreak="0">
     <w:nsid w:val="60C93913"/>
     <w:multiLevelType w:val="multilevel"/>
     <w:tmpl w:val="7FC06092"/>
@@ -5503,7 +6976,156 @@
       </w:rPr>
     </w:lvl>
   </w:abstractNum>
-  <w:abstractNum w:abstractNumId="13" w15:restartNumberingAfterBreak="0">
+  <w:abstractNum w:abstractNumId="17" w15:restartNumberingAfterBreak="0">
+    <w:nsid w:val="64852102"/>
+    <w:multiLevelType w:val="multilevel"/>
+    <w:tmpl w:val="EF1229A6"/>
+    <w:lvl w:ilvl="0">
+      <w:start w:val="1"/>
+      <w:numFmt w:val="bullet"/>
+      <w:lvlText w:val=""/>
+      <w:lvlJc w:val="left"/>
+      <w:pPr>
+        <w:tabs>
+          <w:tab w:val="num" w:pos="720"/>
+        </w:tabs>
+        <w:ind w:left="720" w:hanging="360"/>
+      </w:pPr>
+      <w:rPr>
+        <w:rFonts w:ascii="Symbol" w:hAnsi="Symbol" w:hint="default"/>
+        <w:sz w:val="20"/>
+      </w:rPr>
+    </w:lvl>
+    <w:lvl w:ilvl="1" w:tentative="1">
+      <w:start w:val="1"/>
+      <w:numFmt w:val="bullet"/>
+      <w:lvlText w:val="o"/>
+      <w:lvlJc w:val="left"/>
+      <w:pPr>
+        <w:tabs>
+          <w:tab w:val="num" w:pos="1440"/>
+        </w:tabs>
+        <w:ind w:left="1440" w:hanging="360"/>
+      </w:pPr>
+      <w:rPr>
+        <w:rFonts w:ascii="Courier New" w:hAnsi="Courier New" w:hint="default"/>
+        <w:sz w:val="20"/>
+      </w:rPr>
+    </w:lvl>
+    <w:lvl w:ilvl="2" w:tentative="1">
+      <w:start w:val="1"/>
+      <w:numFmt w:val="bullet"/>
+      <w:lvlText w:val=""/>
+      <w:lvlJc w:val="left"/>
+      <w:pPr>
+        <w:tabs>
+          <w:tab w:val="num" w:pos="2160"/>
+        </w:tabs>
+        <w:ind w:left="2160" w:hanging="360"/>
+      </w:pPr>
+      <w:rPr>
+        <w:rFonts w:ascii="Wingdings" w:hAnsi="Wingdings" w:hint="default"/>
+        <w:sz w:val="20"/>
+      </w:rPr>
+    </w:lvl>
+    <w:lvl w:ilvl="3" w:tentative="1">
+      <w:start w:val="1"/>
+      <w:numFmt w:val="bullet"/>
+      <w:lvlText w:val=""/>
+      <w:lvlJc w:val="left"/>
+      <w:pPr>
+        <w:tabs>
+          <w:tab w:val="num" w:pos="2880"/>
+        </w:tabs>
+        <w:ind w:left="2880" w:hanging="360"/>
+      </w:pPr>
+      <w:rPr>
+        <w:rFonts w:ascii="Wingdings" w:hAnsi="Wingdings" w:hint="default"/>
+        <w:sz w:val="20"/>
+      </w:rPr>
+    </w:lvl>
+    <w:lvl w:ilvl="4" w:tentative="1">
+      <w:start w:val="1"/>
+      <w:numFmt w:val="bullet"/>
+      <w:lvlText w:val=""/>
+      <w:lvlJc w:val="left"/>
+      <w:pPr>
+        <w:tabs>
+          <w:tab w:val="num" w:pos="3600"/>
+        </w:tabs>
+        <w:ind w:left="3600" w:hanging="360"/>
+      </w:pPr>
+      <w:rPr>
+        <w:rFonts w:ascii="Wingdings" w:hAnsi="Wingdings" w:hint="default"/>
+        <w:sz w:val="20"/>
+      </w:rPr>
+    </w:lvl>
+    <w:lvl w:ilvl="5" w:tentative="1">
+      <w:start w:val="1"/>
+      <w:numFmt w:val="bullet"/>
+      <w:lvlText w:val=""/>
+      <w:lvlJc w:val="left"/>
+      <w:pPr>
+        <w:tabs>
+          <w:tab w:val="num" w:pos="4320"/>
+        </w:tabs>
+        <w:ind w:left="4320" w:hanging="360"/>
+      </w:pPr>
+      <w:rPr>
+        <w:rFonts w:ascii="Wingdings" w:hAnsi="Wingdings" w:hint="default"/>
+        <w:sz w:val="20"/>
+      </w:rPr>
+    </w:lvl>
+    <w:lvl w:ilvl="6" w:tentative="1">
+      <w:start w:val="1"/>
+      <w:numFmt w:val="bullet"/>
+      <w:lvlText w:val=""/>
+      <w:lvlJc w:val="left"/>
+      <w:pPr>
+        <w:tabs>
+          <w:tab w:val="num" w:pos="5040"/>
+        </w:tabs>
+        <w:ind w:left="5040" w:hanging="360"/>
+      </w:pPr>
+      <w:rPr>
+        <w:rFonts w:ascii="Wingdings" w:hAnsi="Wingdings" w:hint="default"/>
+        <w:sz w:val="20"/>
+      </w:rPr>
+    </w:lvl>
+    <w:lvl w:ilvl="7" w:tentative="1">
+      <w:start w:val="1"/>
+      <w:numFmt w:val="bullet"/>
+      <w:lvlText w:val=""/>
+      <w:lvlJc w:val="left"/>
+      <w:pPr>
+        <w:tabs>
+          <w:tab w:val="num" w:pos="5760"/>
+        </w:tabs>
+        <w:ind w:left="5760" w:hanging="360"/>
+      </w:pPr>
+      <w:rPr>
+        <w:rFonts w:ascii="Wingdings" w:hAnsi="Wingdings" w:hint="default"/>
+        <w:sz w:val="20"/>
+      </w:rPr>
+    </w:lvl>
+    <w:lvl w:ilvl="8" w:tentative="1">
+      <w:start w:val="1"/>
+      <w:numFmt w:val="bullet"/>
+      <w:lvlText w:val=""/>
+      <w:lvlJc w:val="left"/>
+      <w:pPr>
+        <w:tabs>
+          <w:tab w:val="num" w:pos="6480"/>
+        </w:tabs>
+        <w:ind w:left="6480" w:hanging="360"/>
+      </w:pPr>
+      <w:rPr>
+        <w:rFonts w:ascii="Wingdings" w:hAnsi="Wingdings" w:hint="default"/>
+        <w:sz w:val="20"/>
+      </w:rPr>
+    </w:lvl>
+  </w:abstractNum>
+  <w:abstractNum w:abstractNumId="18" w15:restartNumberingAfterBreak="0">
     <w:nsid w:val="66161B30"/>
     <w:multiLevelType w:val="multilevel"/>
     <w:tmpl w:val="486CED4E"/>
@@ -5652,7 +7274,7 @@
       </w:rPr>
     </w:lvl>
   </w:abstractNum>
-  <w:abstractNum w:abstractNumId="14" w15:restartNumberingAfterBreak="0">
+  <w:abstractNum w:abstractNumId="19" w15:restartNumberingAfterBreak="0">
     <w:nsid w:val="7D075A30"/>
     <w:multiLevelType w:val="multilevel"/>
     <w:tmpl w:val="5E6A7B94"/>
@@ -5770,28 +7392,28 @@
     </w:lvl>
   </w:abstractNum>
   <w:num w:numId="1" w16cid:durableId="1853059366">
-    <w:abstractNumId w:val="6"/>
+    <w:abstractNumId w:val="7"/>
   </w:num>
   <w:num w:numId="2" w16cid:durableId="724842281">
     <w:abstractNumId w:val="0"/>
   </w:num>
   <w:num w:numId="3" w16cid:durableId="1410426719">
-    <w:abstractNumId w:val="7"/>
+    <w:abstractNumId w:val="8"/>
   </w:num>
   <w:num w:numId="4" w16cid:durableId="1157696442">
-    <w:abstractNumId w:val="13"/>
+    <w:abstractNumId w:val="18"/>
   </w:num>
   <w:num w:numId="5" w16cid:durableId="1279487619">
     <w:abstractNumId w:val="1"/>
   </w:num>
   <w:num w:numId="6" w16cid:durableId="1841652854">
-    <w:abstractNumId w:val="9"/>
+    <w:abstractNumId w:val="12"/>
   </w:num>
   <w:num w:numId="7" w16cid:durableId="918518053">
-    <w:abstractNumId w:val="11"/>
+    <w:abstractNumId w:val="14"/>
   </w:num>
   <w:num w:numId="8" w16cid:durableId="626473856">
-    <w:abstractNumId w:val="10"/>
+    <w:abstractNumId w:val="13"/>
   </w:num>
   <w:num w:numId="9" w16cid:durableId="435563816">
     <w:abstractNumId w:val="4"/>
@@ -5800,13 +7422,13 @@
     <w:abstractNumId w:val="5"/>
   </w:num>
   <w:num w:numId="11" w16cid:durableId="989288831">
-    <w:abstractNumId w:val="8"/>
+    <w:abstractNumId w:val="10"/>
   </w:num>
   <w:num w:numId="12" w16cid:durableId="645743979">
-    <w:abstractNumId w:val="12"/>
+    <w:abstractNumId w:val="16"/>
   </w:num>
   <w:num w:numId="13" w16cid:durableId="1375547284">
-    <w:abstractNumId w:val="12"/>
+    <w:abstractNumId w:val="16"/>
     <w:lvlOverride w:ilvl="1">
       <w:lvl w:ilvl="1">
         <w:numFmt w:val="bullet"/>
@@ -5832,7 +7454,22 @@
     <w:abstractNumId w:val="2"/>
   </w:num>
   <w:num w:numId="16" w16cid:durableId="562252882">
-    <w:abstractNumId w:val="14"/>
+    <w:abstractNumId w:val="19"/>
+  </w:num>
+  <w:num w:numId="17" w16cid:durableId="103961920">
+    <w:abstractNumId w:val="9"/>
+  </w:num>
+  <w:num w:numId="18" w16cid:durableId="1183591958">
+    <w:abstractNumId w:val="15"/>
+  </w:num>
+  <w:num w:numId="19" w16cid:durableId="1908177166">
+    <w:abstractNumId w:val="6"/>
+  </w:num>
+  <w:num w:numId="20" w16cid:durableId="304895991">
+    <w:abstractNumId w:val="17"/>
+  </w:num>
+  <w:num w:numId="21" w16cid:durableId="1823346447">
+    <w:abstractNumId w:val="11"/>
   </w:num>
 </w:numbering>
 </file>
@@ -6439,7 +8076,6 @@
   <w:style w:type="character" w:default="1" w:styleId="DefaultParagraphFont">
     <w:name w:val="Default Paragraph Font"/>
     <w:uiPriority w:val="1"/>
-    <w:semiHidden/>
     <w:unhideWhenUsed/>
   </w:style>
   <w:style w:type="table" w:default="1" w:styleId="TableNormal">
@@ -6775,6 +8411,37 @@
       <w:shd w:val="clear" w:color="auto" w:fill="E1DFDD"/>
     </w:rPr>
   </w:style>
+  <w:style w:type="paragraph" w:styleId="NormalWeb">
+    <w:name w:val="Normal (Web)"/>
+    <w:basedOn w:val="Normal"/>
+    <w:uiPriority w:val="99"/>
+    <w:unhideWhenUsed/>
+    <w:rsid w:val="001A559F"/>
+    <w:pPr>
+      <w:spacing w:before="100" w:beforeAutospacing="1" w:after="100" w:afterAutospacing="1" w:line="240" w:lineRule="auto"/>
+    </w:pPr>
+    <w:rPr>
+      <w:rFonts w:ascii="Times New Roman" w:eastAsia="Times New Roman" w:hAnsi="Times New Roman" w:cs="Times New Roman"/>
+      <w:kern w:val="0"/>
+      <w:sz w:val="24"/>
+      <w:szCs w:val="24"/>
+      <w:lang w:eastAsia="en-IN" w:bidi="ar-SA"/>
+      <w14:ligatures w14:val="none"/>
+    </w:rPr>
+  </w:style>
+  <w:style w:type="character" w:styleId="HTMLCode">
+    <w:name w:val="HTML Code"/>
+    <w:basedOn w:val="DefaultParagraphFont"/>
+    <w:uiPriority w:val="99"/>
+    <w:semiHidden/>
+    <w:unhideWhenUsed/>
+    <w:rsid w:val="001A559F"/>
+    <w:rPr>
+      <w:rFonts w:ascii="Courier New" w:eastAsia="Times New Roman" w:hAnsi="Courier New" w:cs="Courier New"/>
+      <w:sz w:val="20"/>
+      <w:szCs w:val="20"/>
+    </w:rPr>
+  </w:style>
 </w:styles>
 </file>
 

</xml_diff>